<commit_message>
Atualiza template às normas ABNT vigentes e amplia o guia ao estudante
- NBR 14724:2024, 10520:2023, 6023:2025 e 6028:2021 aplicadas à classe
  (texifsap.cls) e ao estilo de referências (abnt.bst)
- Novos recursos da classe: lista de quadros, apud, ficha catalográfica
  (marcador e \fichacatalograficapdf), referências locais em apêndices
  (bibunits), \nomecursocapa, títulos de formação (tecnólogo/técnico)
- Estrutura da monografia voltada a computação: problema/pergunta/
  hipótese, trabalhos relacionados com quadro comparativo, variante de
  desenvolvimento de sistema, declaração de uso de IA (Portaria CNPq
  2.664/2026) e textos-guia visíveis em todas as seções
- Exemplos de todos os tipos de referência com obras reais verificadas
- Regras do Regulamento do TCC incorporadas (prazos, dupla, plágio/IA)
- Guia Word (exemplo-tcc.docx) espelhado com o .tex; PDF compilado
  incluído; Makefile com bibtex dos apêndices; .gitignore

Co-Authored-By: Claude Fable 5 <noreply@anthropic.com>
</commit_message>
<xml_diff>
--- a/tcc/exemplo-tcc.docx
+++ b/tcc/exemplo-tcc.docx
@@ -63,7 +63,7 @@
         <w:rPr>
           <w:szCs w:val="24"/>
         </w:rPr>
-        <w:t>NOME DO CURSO</w:t>
+        <w:t>TÉCNICO EM DESENVOLVIMENTO DE SISTEMAS / SUPERIOR DE TECNOLOGIA EM ANÁLISE E DESENVOLVIMENTO DE SISTEMAS</w:t>
       </w:r>
     </w:p>
     <w:p>
@@ -136,6 +136,28 @@
           <w:szCs w:val="24"/>
         </w:rPr>
         <w:t>autor</w:t>
+      </w:r>
+    </w:p>
+    <w:p>
+      <w:pPr>
+        <w:pStyle w:val="Corpodetextook"/>
+        <w:spacing w:line="240" w:lineRule="auto"/>
+        <w:rPr>
+          <w:rFonts w:ascii="Arial" w:hAnsi="Arial" w:cs="Arial"/>
+          <w:sz w:val="20"/>
+          <w:szCs w:val="20"/>
+        </w:rPr>
+      </w:pPr>
+      <w:r>
+        <w:rPr>
+          <w:rFonts w:ascii="Arial" w:hAnsi="Arial" w:cs="Arial"/>
+          <w:b/>
+          <w:bCs/>
+          <w:sz w:val="20"/>
+          <w:szCs w:val="20"/>
+          <w:highlight w:val="yellow"/>
+        </w:rPr>
+        <w:t xml:space="preserve">COMENTÁRIO: o TCC pode ser desenvolvido individualmente ou em dupla (Regulamento do TCC, arts. 4º e 8º). Se em dupla, inclua os dois nomes, um por linha, na capa, na folha de rosto e na folha de aprovação. TITULAÇÃO: mantenha apenas a opção correspondente ao seu curso — Técnico em Desenvolvimento de Sistemas (Curso Técnico em Desenvolvimento de Sistemas) ou Tecnólogo em Análise e Desenvolvimento de Sistemas (Curso Superior de Tecnologia em Análise e Desenvolvimento de Sistemas) — excluindo a outra na capa, na folha de rosto e na folha de aprovação.</w:t>
       </w:r>
     </w:p>
     <w:p>
@@ -702,13 +724,13 @@
         <w:rPr>
           <w:szCs w:val="24"/>
         </w:rPr>
-        <w:t>Trabalho de Conclusão de Curso apresentado como requisito parcial à obtenção do título de Tecnólogo / Bacharel</w:t>
-      </w:r>
-      <w:r>
-        <w:rPr>
-          <w:szCs w:val="24"/>
-        </w:rPr>
-        <w:t xml:space="preserve"> em xxxxx</w:t>
+        <w:t>Trabalho de Conclusão de Curso apresentado como requisito parcial à obtenção do título de Técnico em Desenvolvimento de Sistemas / Tecnólogo em Análise e Desenvolvimento de Sistemas</w:t>
+      </w:r>
+      <w:r>
+        <w:rPr>
+          <w:szCs w:val="24"/>
+        </w:rPr>
+        <w:t xml:space="preserve"/>
       </w:r>
       <w:r>
         <w:rPr>
@@ -720,7 +742,7 @@
         <w:rPr>
           <w:szCs w:val="24"/>
         </w:rPr>
-        <w:t>do Curso xxxxxxxxxxxxx</w:t>
+        <w:t>do Curso Técnico em Desenvolvimento de Sistemas / Superior de Tecnologia em Análise e Desenvolvimento de Sistemas</w:t>
       </w:r>
       <w:r>
         <w:rPr>
@@ -974,6 +996,33 @@
     </w:p>
     <w:p>
       <w:pPr>
+        <w:pStyle w:val="Corpodetextook"/>
+        <w:spacing w:line="240" w:lineRule="auto"/>
+        <w:rPr>
+          <w:rFonts w:ascii="Arial" w:hAnsi="Arial" w:cs="Arial"/>
+          <w:sz w:val="20"/>
+          <w:szCs w:val="20"/>
+        </w:rPr>
+      </w:pPr>
+      <w:r>
+        <w:rPr>
+          <w:rFonts w:ascii="Arial" w:hAnsi="Arial" w:cs="Arial"/>
+          <w:b/>
+          <w:bCs/>
+          <w:sz w:val="20"/>
+          <w:szCs w:val="20"/>
+          <w:highlight w:val="yellow"/>
+        </w:rPr>
+        <w:t xml:space="preserve">COMENTÁRIO: FICHA CATALOGRÁFICA (elemento obrigatório na versão final). Esta página é o verso da folha de rosto e fica reservada para a ficha catalográfica. A ficha NÃO é elaborada pelo estudante: deve ser solicitada à Biblioteca do câmpus depois da banca e das correções finais, pois dados como o número de folhas mudam até lá. Ao receber a ficha, insira-a nesta página, no lugar deste comentário. Conforme a NBR 14724:2024, esta página não é contada nem numerada. Durante a escrita do trabalho, apenas mantenha esta página como está.</w:t>
+      </w:r>
+    </w:p>
+    <w:p>
+      <w:r>
+        <w:br w:type="page"/>
+      </w:r>
+    </w:p>
+    <w:p>
+      <w:pPr>
         <w:ind w:firstLine="0"/>
         <w:jc w:val="center"/>
         <w:rPr>
@@ -1065,7 +1114,7 @@
         <w:rPr>
           <w:szCs w:val="24"/>
         </w:rPr>
-        <w:t xml:space="preserve">Trabalho de Conclusão de Curso apresentado como requisito parcial à obtenção do título de Tecnólogo / Bacharel em xxxxx, do Curso xxxxxxxxxxxxx do Instituto Federal Sul-rio-grandense – Câmpus Sapucaia do Sul. </w:t>
+        <w:t xml:space="preserve">Trabalho de Conclusão de Curso apresentado como requisito parcial à obtenção do título de Técnico em Desenvolvimento de Sistemas / Tecnólogo em Análise e Desenvolvimento de Sistemas, do Curso Técnico em Desenvolvimento de Sistemas / Superior de Tecnologia em Análise e Desenvolvimento de Sistemas do Instituto Federal Sul-rio-grandense – Câmpus Sapucaia do Sul. </w:t>
       </w:r>
     </w:p>
     <w:p>
@@ -1618,7 +1667,7 @@
           <w:szCs w:val="20"/>
           <w:highlight w:val="yellow"/>
         </w:rPr>
-        <w:t>completo e instituição vinculada.</w:t>
+        <w:t>completo e instituição vinculada. Prazos (Regulamento do TCC, arts. 24 e 30): a cópia do TCC deve ser enviada aos membros da banca com, no mínimo, 15 dias de antecedência da defesa; a versão final corrigida deve ser entregue no prazo definido pela banca, de no máximo 10 dias após a apresentação oral.</w:t>
       </w:r>
     </w:p>
     <w:p>
@@ -2316,469 +2365,7 @@
         <w:ind w:firstLine="0"/>
       </w:pPr>
       <w:r>
-        <w:t>Texto texto texto texto texto</w:t>
-      </w:r>
-      <w:r>
-        <w:t xml:space="preserve"> </w:t>
-      </w:r>
-      <w:r>
-        <w:t>texto texto</w:t>
-      </w:r>
-      <w:r>
-        <w:t xml:space="preserve"> </w:t>
-      </w:r>
-      <w:r>
-        <w:t>texto texto</w:t>
-      </w:r>
-      <w:r>
-        <w:t xml:space="preserve"> </w:t>
-      </w:r>
-      <w:r>
-        <w:t>texto texto</w:t>
-      </w:r>
-      <w:r>
-        <w:t xml:space="preserve"> </w:t>
-      </w:r>
-      <w:r>
-        <w:t>texto texto</w:t>
-      </w:r>
-      <w:r>
-        <w:t xml:space="preserve"> </w:t>
-      </w:r>
-      <w:r>
-        <w:t>texto texto</w:t>
-      </w:r>
-      <w:r>
-        <w:t xml:space="preserve"> </w:t>
-      </w:r>
-      <w:r>
-        <w:t>texto texto</w:t>
-      </w:r>
-      <w:r>
-        <w:t xml:space="preserve"> </w:t>
-      </w:r>
-      <w:r>
-        <w:t>texto texto</w:t>
-      </w:r>
-      <w:r>
-        <w:t xml:space="preserve"> </w:t>
-      </w:r>
-      <w:r>
-        <w:t>texto texto</w:t>
-      </w:r>
-      <w:r>
-        <w:t xml:space="preserve"> </w:t>
-      </w:r>
-      <w:r>
-        <w:t>texto texto</w:t>
-      </w:r>
-      <w:r>
-        <w:t xml:space="preserve"> </w:t>
-      </w:r>
-      <w:r>
-        <w:t>texto texto</w:t>
-      </w:r>
-      <w:r>
-        <w:t xml:space="preserve"> </w:t>
-      </w:r>
-      <w:r>
-        <w:t>texto texto</w:t>
-      </w:r>
-      <w:r>
-        <w:t xml:space="preserve"> </w:t>
-      </w:r>
-      <w:r>
-        <w:t>texto texto</w:t>
-      </w:r>
-      <w:r>
-        <w:t xml:space="preserve"> </w:t>
-      </w:r>
-      <w:r>
-        <w:t>texto texto</w:t>
-      </w:r>
-      <w:r>
-        <w:t xml:space="preserve"> </w:t>
-      </w:r>
-      <w:r>
-        <w:t>texto texto</w:t>
-      </w:r>
-      <w:r>
-        <w:t xml:space="preserve"> </w:t>
-      </w:r>
-      <w:r>
-        <w:t>texto texto</w:t>
-      </w:r>
-      <w:r>
-        <w:t xml:space="preserve"> </w:t>
-      </w:r>
-      <w:r>
-        <w:t>texto texto</w:t>
-      </w:r>
-      <w:r>
-        <w:t xml:space="preserve"> </w:t>
-      </w:r>
-      <w:r>
-        <w:t>texto texto</w:t>
-      </w:r>
-      <w:r>
-        <w:t xml:space="preserve"> </w:t>
-      </w:r>
-      <w:r>
-        <w:t>texto texto</w:t>
-      </w:r>
-      <w:r>
-        <w:t xml:space="preserve"> </w:t>
-      </w:r>
-      <w:r>
-        <w:t>texto texto</w:t>
-      </w:r>
-      <w:r>
-        <w:t xml:space="preserve"> </w:t>
-      </w:r>
-      <w:r>
-        <w:t>texto texto</w:t>
-      </w:r>
-      <w:r>
-        <w:t xml:space="preserve"> </w:t>
-      </w:r>
-      <w:r>
-        <w:t>texto texto</w:t>
-      </w:r>
-      <w:r>
-        <w:t xml:space="preserve"> </w:t>
-      </w:r>
-      <w:r>
-        <w:t>texto texto</w:t>
-      </w:r>
-      <w:r>
-        <w:t xml:space="preserve"> </w:t>
-      </w:r>
-      <w:r>
-        <w:t>texto texto</w:t>
-      </w:r>
-      <w:r>
-        <w:t xml:space="preserve"> </w:t>
-      </w:r>
-      <w:r>
-        <w:t>texto texto</w:t>
-      </w:r>
-      <w:r>
-        <w:t xml:space="preserve"> </w:t>
-      </w:r>
-      <w:r>
-        <w:t>texto texto</w:t>
-      </w:r>
-      <w:r>
-        <w:t xml:space="preserve"> </w:t>
-      </w:r>
-      <w:r>
-        <w:t>texto texto</w:t>
-      </w:r>
-      <w:r>
-        <w:t xml:space="preserve"> </w:t>
-      </w:r>
-      <w:r>
-        <w:t>texto texto</w:t>
-      </w:r>
-      <w:r>
-        <w:t xml:space="preserve"> </w:t>
-      </w:r>
-      <w:r>
-        <w:t>texto texto</w:t>
-      </w:r>
-      <w:r>
-        <w:t xml:space="preserve"> </w:t>
-      </w:r>
-      <w:r>
-        <w:t>texto texto</w:t>
-      </w:r>
-      <w:r>
-        <w:t xml:space="preserve"> </w:t>
-      </w:r>
-      <w:r>
-        <w:t>texto texto</w:t>
-      </w:r>
-      <w:r>
-        <w:t xml:space="preserve"> </w:t>
-      </w:r>
-      <w:r>
-        <w:t>texto texto</w:t>
-      </w:r>
-      <w:r>
-        <w:t xml:space="preserve"> </w:t>
-      </w:r>
-      <w:r>
-        <w:t>texto texto</w:t>
-      </w:r>
-      <w:r>
-        <w:t xml:space="preserve"> </w:t>
-      </w:r>
-      <w:r>
-        <w:t>texto texto</w:t>
-      </w:r>
-      <w:r>
-        <w:t xml:space="preserve"> </w:t>
-      </w:r>
-      <w:r>
-        <w:t>texto texto texto texto</w:t>
-      </w:r>
-      <w:r>
-        <w:t xml:space="preserve"> </w:t>
-      </w:r>
-      <w:r>
-        <w:t>texto texto</w:t>
-      </w:r>
-      <w:r>
-        <w:t xml:space="preserve"> </w:t>
-      </w:r>
-      <w:r>
-        <w:t>texto texto</w:t>
-      </w:r>
-      <w:r>
-        <w:t xml:space="preserve"> </w:t>
-      </w:r>
-      <w:r>
-        <w:t>texto texto</w:t>
-      </w:r>
-      <w:r>
-        <w:t xml:space="preserve"> </w:t>
-      </w:r>
-      <w:r>
-        <w:t>texto texto</w:t>
-      </w:r>
-      <w:r>
-        <w:t xml:space="preserve"> </w:t>
-      </w:r>
-      <w:r>
-        <w:t>texto texto</w:t>
-      </w:r>
-      <w:r>
-        <w:t xml:space="preserve"> </w:t>
-      </w:r>
-      <w:r>
-        <w:t>texto texto</w:t>
-      </w:r>
-      <w:r>
-        <w:t xml:space="preserve"> </w:t>
-      </w:r>
-      <w:r>
-        <w:t>texto texto</w:t>
-      </w:r>
-      <w:r>
-        <w:t xml:space="preserve"> </w:t>
-      </w:r>
-      <w:r>
-        <w:t>texto texto</w:t>
-      </w:r>
-      <w:r>
-        <w:t xml:space="preserve"> </w:t>
-      </w:r>
-      <w:r>
-        <w:t>texto texto</w:t>
-      </w:r>
-      <w:r>
-        <w:t xml:space="preserve"> </w:t>
-      </w:r>
-      <w:r>
-        <w:t>texto texto</w:t>
-      </w:r>
-      <w:r>
-        <w:t xml:space="preserve"> </w:t>
-      </w:r>
-      <w:r>
-        <w:t>texto texto</w:t>
-      </w:r>
-      <w:r>
-        <w:t xml:space="preserve"> </w:t>
-      </w:r>
-      <w:r>
-        <w:t>texto texto</w:t>
-      </w:r>
-      <w:r>
-        <w:t xml:space="preserve"> </w:t>
-      </w:r>
-      <w:r>
-        <w:t>texto texto</w:t>
-      </w:r>
-      <w:r>
-        <w:t xml:space="preserve"> </w:t>
-      </w:r>
-      <w:r>
-        <w:t>texto texto</w:t>
-      </w:r>
-      <w:r>
-        <w:t xml:space="preserve"> </w:t>
-      </w:r>
-      <w:r>
-        <w:t>texto texto</w:t>
-      </w:r>
-      <w:r>
-        <w:t xml:space="preserve"> </w:t>
-      </w:r>
-      <w:r>
-        <w:t>texto texto</w:t>
-      </w:r>
-      <w:r>
-        <w:t xml:space="preserve"> </w:t>
-      </w:r>
-      <w:r>
-        <w:t>texto texto</w:t>
-      </w:r>
-      <w:r>
-        <w:t xml:space="preserve"> </w:t>
-      </w:r>
-      <w:r>
-        <w:t>texto texto</w:t>
-      </w:r>
-      <w:r>
-        <w:t xml:space="preserve"> </w:t>
-      </w:r>
-      <w:r>
-        <w:t>texto texto</w:t>
-      </w:r>
-      <w:r>
-        <w:t xml:space="preserve"> </w:t>
-      </w:r>
-      <w:r>
-        <w:t>texto texto</w:t>
-      </w:r>
-      <w:r>
-        <w:t xml:space="preserve"> </w:t>
-      </w:r>
-      <w:r>
-        <w:t>texto texto</w:t>
-      </w:r>
-      <w:r>
-        <w:t xml:space="preserve"> </w:t>
-      </w:r>
-      <w:r>
-        <w:t>texto texto</w:t>
-      </w:r>
-      <w:r>
-        <w:t xml:space="preserve"> </w:t>
-      </w:r>
-      <w:r>
-        <w:t>texto texto</w:t>
-      </w:r>
-      <w:r>
-        <w:t xml:space="preserve"> </w:t>
-      </w:r>
-      <w:r>
-        <w:t>texto texto</w:t>
-      </w:r>
-      <w:r>
-        <w:t xml:space="preserve"> </w:t>
-      </w:r>
-      <w:r>
-        <w:t>texto texto</w:t>
-      </w:r>
-      <w:r>
-        <w:t xml:space="preserve"> </w:t>
-      </w:r>
-      <w:r>
-        <w:t>texto texto</w:t>
-      </w:r>
-      <w:r>
-        <w:t xml:space="preserve"> </w:t>
-      </w:r>
-      <w:r>
-        <w:t>texto texto</w:t>
-      </w:r>
-      <w:r>
-        <w:t xml:space="preserve"> </w:t>
-      </w:r>
-      <w:r>
-        <w:t>texto texto</w:t>
-      </w:r>
-      <w:r>
-        <w:t xml:space="preserve"> </w:t>
-      </w:r>
-      <w:r>
-        <w:t>texto texto</w:t>
-      </w:r>
-      <w:r>
-        <w:t xml:space="preserve"> </w:t>
-      </w:r>
-      <w:r>
-        <w:t>texto texto</w:t>
-      </w:r>
-      <w:r>
-        <w:t xml:space="preserve"> </w:t>
-      </w:r>
-      <w:r>
-        <w:t>texto texto</w:t>
-      </w:r>
-      <w:r>
-        <w:t xml:space="preserve"> </w:t>
-      </w:r>
-      <w:r>
-        <w:t>texto texto</w:t>
-      </w:r>
-      <w:r>
-        <w:t xml:space="preserve"> </w:t>
-      </w:r>
-      <w:r>
-        <w:t>texto texto</w:t>
-      </w:r>
-      <w:r>
-        <w:t xml:space="preserve"> </w:t>
-      </w:r>
-      <w:r>
-        <w:t>texto texto</w:t>
-      </w:r>
-      <w:r>
-        <w:t xml:space="preserve"> </w:t>
-      </w:r>
-      <w:r>
-        <w:t>texto texto</w:t>
-      </w:r>
-      <w:r>
-        <w:t xml:space="preserve"> </w:t>
-      </w:r>
-      <w:r>
-        <w:t>texto texto</w:t>
-      </w:r>
-      <w:r>
-        <w:t xml:space="preserve"> </w:t>
-      </w:r>
-      <w:r>
-        <w:t>texto texto</w:t>
-      </w:r>
-      <w:r>
-        <w:t xml:space="preserve"> </w:t>
-      </w:r>
-      <w:r>
-        <w:t>texto texto</w:t>
-      </w:r>
-      <w:r>
-        <w:t xml:space="preserve"> </w:t>
-      </w:r>
-      <w:r>
-        <w:t>texto texto</w:t>
-      </w:r>
-      <w:r>
-        <w:t xml:space="preserve"> </w:t>
-      </w:r>
-      <w:r>
-        <w:t>texto texto</w:t>
-      </w:r>
-      <w:r>
-        <w:t xml:space="preserve"> </w:t>
-      </w:r>
-      <w:r>
-        <w:t>texto texto</w:t>
-      </w:r>
-      <w:r>
-        <w:t xml:space="preserve"> </w:t>
-      </w:r>
-      <w:r>
-        <w:t>texto texto</w:t>
-      </w:r>
-      <w:r>
-        <w:t xml:space="preserve"> </w:t>
-      </w:r>
-      <w:r>
-        <w:t>texto texto.</w:t>
+        <w:t xml:space="preserve">Escreva aqui o resumo do trabalho, em um único parágrafo de 150 a 500 palavras, sem recuo e sem citações: comece pelo objetivo do trabalho e apresente, na sequência, o método utilizado, os principais resultados e a conclusão. O resumo é a porta de entrada do trabalho: muitos leitores decidem continuar (ou não) a leitura a partir dele.</w:t>
       </w:r>
     </w:p>
     <w:p>
@@ -2940,7 +2527,7 @@
           <w:highlight w:val="yellow"/>
           <w:shd w:val="clear" w:color="auto" w:fill="FFFF00"/>
         </w:rPr>
-        <w:t>deve conter apenas um parágrafo e no máximo 500 palavras.</w:t>
+        <w:t>deve conter apenas um parágrafo e de 150 a 500 palavras.</w:t>
       </w:r>
       <w:r>
         <w:rPr>
@@ -3036,469 +2623,7 @@
         <w:ind w:firstLine="0"/>
       </w:pPr>
       <w:r>
-        <w:t>Texto texto texto texto texto</w:t>
-      </w:r>
-      <w:r>
-        <w:t xml:space="preserve"> </w:t>
-      </w:r>
-      <w:r>
-        <w:t>texto texto</w:t>
-      </w:r>
-      <w:r>
-        <w:t xml:space="preserve"> </w:t>
-      </w:r>
-      <w:r>
-        <w:t>texto texto</w:t>
-      </w:r>
-      <w:r>
-        <w:t xml:space="preserve"> </w:t>
-      </w:r>
-      <w:r>
-        <w:t>texto texto</w:t>
-      </w:r>
-      <w:r>
-        <w:t xml:space="preserve"> </w:t>
-      </w:r>
-      <w:r>
-        <w:t>texto texto</w:t>
-      </w:r>
-      <w:r>
-        <w:t xml:space="preserve"> </w:t>
-      </w:r>
-      <w:r>
-        <w:t>texto texto</w:t>
-      </w:r>
-      <w:r>
-        <w:t xml:space="preserve"> </w:t>
-      </w:r>
-      <w:r>
-        <w:t>texto texto</w:t>
-      </w:r>
-      <w:r>
-        <w:t xml:space="preserve"> </w:t>
-      </w:r>
-      <w:r>
-        <w:t>texto texto</w:t>
-      </w:r>
-      <w:r>
-        <w:t xml:space="preserve"> </w:t>
-      </w:r>
-      <w:r>
-        <w:t>texto texto</w:t>
-      </w:r>
-      <w:r>
-        <w:t xml:space="preserve"> </w:t>
-      </w:r>
-      <w:r>
-        <w:t>texto texto</w:t>
-      </w:r>
-      <w:r>
-        <w:t xml:space="preserve"> </w:t>
-      </w:r>
-      <w:r>
-        <w:t>texto texto</w:t>
-      </w:r>
-      <w:r>
-        <w:t xml:space="preserve"> </w:t>
-      </w:r>
-      <w:r>
-        <w:t>texto texto</w:t>
-      </w:r>
-      <w:r>
-        <w:t xml:space="preserve"> </w:t>
-      </w:r>
-      <w:r>
-        <w:t>texto texto</w:t>
-      </w:r>
-      <w:r>
-        <w:t xml:space="preserve"> </w:t>
-      </w:r>
-      <w:r>
-        <w:t>texto texto</w:t>
-      </w:r>
-      <w:r>
-        <w:t xml:space="preserve"> </w:t>
-      </w:r>
-      <w:r>
-        <w:t>texto texto</w:t>
-      </w:r>
-      <w:r>
-        <w:t xml:space="preserve"> </w:t>
-      </w:r>
-      <w:r>
-        <w:t>texto texto</w:t>
-      </w:r>
-      <w:r>
-        <w:t xml:space="preserve"> </w:t>
-      </w:r>
-      <w:r>
-        <w:t>texto texto</w:t>
-      </w:r>
-      <w:r>
-        <w:t xml:space="preserve"> </w:t>
-      </w:r>
-      <w:r>
-        <w:t>texto texto</w:t>
-      </w:r>
-      <w:r>
-        <w:t xml:space="preserve"> </w:t>
-      </w:r>
-      <w:r>
-        <w:t>texto texto</w:t>
-      </w:r>
-      <w:r>
-        <w:t xml:space="preserve"> </w:t>
-      </w:r>
-      <w:r>
-        <w:t>texto texto</w:t>
-      </w:r>
-      <w:r>
-        <w:t xml:space="preserve"> </w:t>
-      </w:r>
-      <w:r>
-        <w:t>texto texto</w:t>
-      </w:r>
-      <w:r>
-        <w:t xml:space="preserve"> </w:t>
-      </w:r>
-      <w:r>
-        <w:t>texto texto</w:t>
-      </w:r>
-      <w:r>
-        <w:t xml:space="preserve"> </w:t>
-      </w:r>
-      <w:r>
-        <w:t>texto texto</w:t>
-      </w:r>
-      <w:r>
-        <w:t xml:space="preserve"> </w:t>
-      </w:r>
-      <w:r>
-        <w:t>texto texto</w:t>
-      </w:r>
-      <w:r>
-        <w:t xml:space="preserve"> </w:t>
-      </w:r>
-      <w:r>
-        <w:t>texto texto</w:t>
-      </w:r>
-      <w:r>
-        <w:t xml:space="preserve"> </w:t>
-      </w:r>
-      <w:r>
-        <w:t>texto texto</w:t>
-      </w:r>
-      <w:r>
-        <w:t xml:space="preserve"> </w:t>
-      </w:r>
-      <w:r>
-        <w:t>texto texto</w:t>
-      </w:r>
-      <w:r>
-        <w:t xml:space="preserve"> </w:t>
-      </w:r>
-      <w:r>
-        <w:t>texto texto</w:t>
-      </w:r>
-      <w:r>
-        <w:t xml:space="preserve"> </w:t>
-      </w:r>
-      <w:r>
-        <w:t>texto texto</w:t>
-      </w:r>
-      <w:r>
-        <w:t xml:space="preserve"> </w:t>
-      </w:r>
-      <w:r>
-        <w:t>texto texto</w:t>
-      </w:r>
-      <w:r>
-        <w:t xml:space="preserve"> </w:t>
-      </w:r>
-      <w:r>
-        <w:t>texto texto</w:t>
-      </w:r>
-      <w:r>
-        <w:t xml:space="preserve"> </w:t>
-      </w:r>
-      <w:r>
-        <w:t>texto texto</w:t>
-      </w:r>
-      <w:r>
-        <w:t xml:space="preserve"> </w:t>
-      </w:r>
-      <w:r>
-        <w:t>texto texto</w:t>
-      </w:r>
-      <w:r>
-        <w:t xml:space="preserve"> </w:t>
-      </w:r>
-      <w:r>
-        <w:t>texto texto</w:t>
-      </w:r>
-      <w:r>
-        <w:t xml:space="preserve"> </w:t>
-      </w:r>
-      <w:r>
-        <w:t>texto texto texto texto</w:t>
-      </w:r>
-      <w:r>
-        <w:t xml:space="preserve"> </w:t>
-      </w:r>
-      <w:r>
-        <w:t>texto texto</w:t>
-      </w:r>
-      <w:r>
-        <w:t xml:space="preserve"> </w:t>
-      </w:r>
-      <w:r>
-        <w:t>texto texto</w:t>
-      </w:r>
-      <w:r>
-        <w:t xml:space="preserve"> </w:t>
-      </w:r>
-      <w:r>
-        <w:t>texto texto</w:t>
-      </w:r>
-      <w:r>
-        <w:t xml:space="preserve"> </w:t>
-      </w:r>
-      <w:r>
-        <w:t>texto texto</w:t>
-      </w:r>
-      <w:r>
-        <w:t xml:space="preserve"> </w:t>
-      </w:r>
-      <w:r>
-        <w:t>texto texto</w:t>
-      </w:r>
-      <w:r>
-        <w:t xml:space="preserve"> </w:t>
-      </w:r>
-      <w:r>
-        <w:t>texto texto</w:t>
-      </w:r>
-      <w:r>
-        <w:t xml:space="preserve"> </w:t>
-      </w:r>
-      <w:r>
-        <w:t>texto texto</w:t>
-      </w:r>
-      <w:r>
-        <w:t xml:space="preserve"> </w:t>
-      </w:r>
-      <w:r>
-        <w:t>texto texto</w:t>
-      </w:r>
-      <w:r>
-        <w:t xml:space="preserve"> </w:t>
-      </w:r>
-      <w:r>
-        <w:t>texto texto</w:t>
-      </w:r>
-      <w:r>
-        <w:t xml:space="preserve"> </w:t>
-      </w:r>
-      <w:r>
-        <w:t>texto texto</w:t>
-      </w:r>
-      <w:r>
-        <w:t xml:space="preserve"> </w:t>
-      </w:r>
-      <w:r>
-        <w:t>texto texto</w:t>
-      </w:r>
-      <w:r>
-        <w:t xml:space="preserve"> </w:t>
-      </w:r>
-      <w:r>
-        <w:t>texto texto</w:t>
-      </w:r>
-      <w:r>
-        <w:t xml:space="preserve"> </w:t>
-      </w:r>
-      <w:r>
-        <w:t>texto texto</w:t>
-      </w:r>
-      <w:r>
-        <w:t xml:space="preserve"> </w:t>
-      </w:r>
-      <w:r>
-        <w:t>texto texto</w:t>
-      </w:r>
-      <w:r>
-        <w:t xml:space="preserve"> </w:t>
-      </w:r>
-      <w:r>
-        <w:t>texto texto</w:t>
-      </w:r>
-      <w:r>
-        <w:t xml:space="preserve"> </w:t>
-      </w:r>
-      <w:r>
-        <w:t>texto texto</w:t>
-      </w:r>
-      <w:r>
-        <w:t xml:space="preserve"> </w:t>
-      </w:r>
-      <w:r>
-        <w:t>texto texto</w:t>
-      </w:r>
-      <w:r>
-        <w:t xml:space="preserve"> </w:t>
-      </w:r>
-      <w:r>
-        <w:t>texto texto</w:t>
-      </w:r>
-      <w:r>
-        <w:t xml:space="preserve"> </w:t>
-      </w:r>
-      <w:r>
-        <w:t>texto texto</w:t>
-      </w:r>
-      <w:r>
-        <w:t xml:space="preserve"> </w:t>
-      </w:r>
-      <w:r>
-        <w:t>texto texto</w:t>
-      </w:r>
-      <w:r>
-        <w:t xml:space="preserve"> </w:t>
-      </w:r>
-      <w:r>
-        <w:t>texto texto</w:t>
-      </w:r>
-      <w:r>
-        <w:t xml:space="preserve"> </w:t>
-      </w:r>
-      <w:r>
-        <w:t>texto texto</w:t>
-      </w:r>
-      <w:r>
-        <w:t xml:space="preserve"> </w:t>
-      </w:r>
-      <w:r>
-        <w:t>texto texto</w:t>
-      </w:r>
-      <w:r>
-        <w:t xml:space="preserve"> </w:t>
-      </w:r>
-      <w:r>
-        <w:t>texto texto</w:t>
-      </w:r>
-      <w:r>
-        <w:t xml:space="preserve"> </w:t>
-      </w:r>
-      <w:r>
-        <w:t>texto texto</w:t>
-      </w:r>
-      <w:r>
-        <w:t xml:space="preserve"> </w:t>
-      </w:r>
-      <w:r>
-        <w:t>texto texto</w:t>
-      </w:r>
-      <w:r>
-        <w:t xml:space="preserve"> </w:t>
-      </w:r>
-      <w:r>
-        <w:t>texto texto</w:t>
-      </w:r>
-      <w:r>
-        <w:t xml:space="preserve"> </w:t>
-      </w:r>
-      <w:r>
-        <w:t>texto texto</w:t>
-      </w:r>
-      <w:r>
-        <w:t xml:space="preserve"> </w:t>
-      </w:r>
-      <w:r>
-        <w:t>texto texto</w:t>
-      </w:r>
-      <w:r>
-        <w:t xml:space="preserve"> </w:t>
-      </w:r>
-      <w:r>
-        <w:t>texto texto</w:t>
-      </w:r>
-      <w:r>
-        <w:t xml:space="preserve"> </w:t>
-      </w:r>
-      <w:r>
-        <w:t>texto texto</w:t>
-      </w:r>
-      <w:r>
-        <w:t xml:space="preserve"> </w:t>
-      </w:r>
-      <w:r>
-        <w:t>texto texto</w:t>
-      </w:r>
-      <w:r>
-        <w:t xml:space="preserve"> </w:t>
-      </w:r>
-      <w:r>
-        <w:t>texto texto</w:t>
-      </w:r>
-      <w:r>
-        <w:t xml:space="preserve"> </w:t>
-      </w:r>
-      <w:r>
-        <w:t>texto texto</w:t>
-      </w:r>
-      <w:r>
-        <w:t xml:space="preserve"> </w:t>
-      </w:r>
-      <w:r>
-        <w:t>texto texto</w:t>
-      </w:r>
-      <w:r>
-        <w:t xml:space="preserve"> </w:t>
-      </w:r>
-      <w:r>
-        <w:t>texto texto</w:t>
-      </w:r>
-      <w:r>
-        <w:t xml:space="preserve"> </w:t>
-      </w:r>
-      <w:r>
-        <w:t>texto texto</w:t>
-      </w:r>
-      <w:r>
-        <w:t xml:space="preserve"> </w:t>
-      </w:r>
-      <w:r>
-        <w:t>texto texto</w:t>
-      </w:r>
-      <w:r>
-        <w:t xml:space="preserve"> </w:t>
-      </w:r>
-      <w:r>
-        <w:t>texto texto</w:t>
-      </w:r>
-      <w:r>
-        <w:t xml:space="preserve"> </w:t>
-      </w:r>
-      <w:r>
-        <w:t>texto texto</w:t>
-      </w:r>
-      <w:r>
-        <w:t xml:space="preserve"> </w:t>
-      </w:r>
-      <w:r>
-        <w:t>texto texto</w:t>
-      </w:r>
-      <w:r>
-        <w:t xml:space="preserve"> </w:t>
-      </w:r>
-      <w:r>
-        <w:t>texto texto</w:t>
-      </w:r>
-      <w:r>
-        <w:t xml:space="preserve"> </w:t>
-      </w:r>
-      <w:r>
-        <w:t>texto texto.</w:t>
+        <w:t xml:space="preserve">Write here the English version of the resumo, as a faithful translation: a single paragraph of 150 to 500 words, beginning with the objective of the work, followed by the method, the main results and the conclusion.</w:t>
       </w:r>
     </w:p>
     <w:p>
@@ -5326,7 +4451,7 @@
           <w:rPr>
             <w:rStyle w:val="Hyperlink"/>
           </w:rPr>
-          <w:t>APRESENTAÇÃO E ANÁLISE DOS DADOS</w:t>
+          <w:t>RESULTADOS</w:t>
         </w:r>
         <w:r>
           <w:rPr>
@@ -5887,211 +5012,7 @@
     </w:p>
     <w:p>
       <w:r>
-        <w:t xml:space="preserve">Texto </w:t>
-      </w:r>
-      <w:proofErr w:type="gramStart"/>
-      <w:r>
-        <w:t>texto</w:t>
-      </w:r>
-      <w:proofErr w:type="gramEnd"/>
-      <w:r>
-        <w:t xml:space="preserve"> texto texto</w:t>
-      </w:r>
-      <w:r>
-        <w:t xml:space="preserve"> </w:t>
-      </w:r>
-      <w:r>
-        <w:t>texto texto</w:t>
-      </w:r>
-      <w:r>
-        <w:t xml:space="preserve"> </w:t>
-      </w:r>
-      <w:r>
-        <w:t>texto texto</w:t>
-      </w:r>
-      <w:r>
-        <w:t xml:space="preserve"> </w:t>
-      </w:r>
-      <w:r>
-        <w:t>texto texto</w:t>
-      </w:r>
-      <w:r>
-        <w:t xml:space="preserve"> </w:t>
-      </w:r>
-      <w:r>
-        <w:t>texto texto</w:t>
-      </w:r>
-      <w:r>
-        <w:t xml:space="preserve"> </w:t>
-      </w:r>
-      <w:r>
-        <w:t>texto texto</w:t>
-      </w:r>
-      <w:r>
-        <w:t xml:space="preserve"> </w:t>
-      </w:r>
-      <w:r>
-        <w:t>texto texto</w:t>
-      </w:r>
-      <w:r>
-        <w:t xml:space="preserve"> </w:t>
-      </w:r>
-      <w:r>
-        <w:t>texto texto</w:t>
-      </w:r>
-      <w:r>
-        <w:t xml:space="preserve"> </w:t>
-      </w:r>
-      <w:r>
-        <w:t>texto texto</w:t>
-      </w:r>
-      <w:r>
-        <w:t xml:space="preserve"> </w:t>
-      </w:r>
-      <w:r>
-        <w:t>texto texto</w:t>
-      </w:r>
-      <w:r>
-        <w:t xml:space="preserve"> </w:t>
-      </w:r>
-      <w:r>
-        <w:t>texto texto</w:t>
-      </w:r>
-      <w:r>
-        <w:t xml:space="preserve"> </w:t>
-      </w:r>
-      <w:r>
-        <w:t>texto texto</w:t>
-      </w:r>
-      <w:r>
-        <w:t xml:space="preserve"> </w:t>
-      </w:r>
-      <w:r>
-        <w:t>texto texto</w:t>
-      </w:r>
-      <w:r>
-        <w:t xml:space="preserve"> </w:t>
-      </w:r>
-      <w:r>
-        <w:t>texto texto</w:t>
-      </w:r>
-      <w:r>
-        <w:t xml:space="preserve"> </w:t>
-      </w:r>
-      <w:r>
-        <w:t>texto texto</w:t>
-      </w:r>
-      <w:r>
-        <w:t xml:space="preserve"> </w:t>
-      </w:r>
-      <w:r>
-        <w:t>texto texto.</w:t>
-      </w:r>
-    </w:p>
-    <w:p>
-      <w:r>
-        <w:t xml:space="preserve">Texto </w:t>
-      </w:r>
-      <w:proofErr w:type="gramStart"/>
-      <w:r>
-        <w:t>texto</w:t>
-      </w:r>
-      <w:proofErr w:type="gramEnd"/>
-      <w:r>
-        <w:t xml:space="preserve"> </w:t>
-      </w:r>
-      <w:r>
-        <w:t>texto texto</w:t>
-      </w:r>
-      <w:r>
-        <w:t xml:space="preserve"> </w:t>
-      </w:r>
-      <w:r>
-        <w:t>texto texto</w:t>
-      </w:r>
-      <w:r>
-        <w:t xml:space="preserve"> </w:t>
-      </w:r>
-      <w:r>
-        <w:t>texto texto</w:t>
-      </w:r>
-      <w:r>
-        <w:t xml:space="preserve"> </w:t>
-      </w:r>
-      <w:r>
-        <w:t>texto texto</w:t>
-      </w:r>
-      <w:r>
-        <w:t xml:space="preserve"> </w:t>
-      </w:r>
-      <w:r>
-        <w:t>texto texto</w:t>
-      </w:r>
-      <w:r>
-        <w:t xml:space="preserve"> </w:t>
-      </w:r>
-      <w:r>
-        <w:t>texto texto</w:t>
-      </w:r>
-      <w:r>
-        <w:t xml:space="preserve"> </w:t>
-      </w:r>
-      <w:r>
-        <w:t>texto texto</w:t>
-      </w:r>
-      <w:r>
-        <w:t xml:space="preserve"> </w:t>
-      </w:r>
-      <w:r>
-        <w:t>texto texto</w:t>
-      </w:r>
-      <w:r>
-        <w:t xml:space="preserve"> </w:t>
-      </w:r>
-      <w:r>
-        <w:t>texto texto</w:t>
-      </w:r>
-      <w:r>
-        <w:t xml:space="preserve"> </w:t>
-      </w:r>
-      <w:r>
-        <w:t>texto texto</w:t>
-      </w:r>
-      <w:r>
-        <w:t xml:space="preserve"> </w:t>
-      </w:r>
-      <w:r>
-        <w:t>texto texto</w:t>
-      </w:r>
-      <w:r>
-        <w:t xml:space="preserve"> </w:t>
-      </w:r>
-      <w:r>
-        <w:t>texto texto</w:t>
-      </w:r>
-      <w:r>
-        <w:t xml:space="preserve"> </w:t>
-      </w:r>
-      <w:r>
-        <w:t>texto texto</w:t>
-      </w:r>
-      <w:r>
-        <w:t xml:space="preserve"> </w:t>
-      </w:r>
-      <w:r>
-        <w:t>texto texto</w:t>
-      </w:r>
-      <w:r>
-        <w:t xml:space="preserve"> </w:t>
-      </w:r>
-      <w:r>
-        <w:t>texto texto</w:t>
-      </w:r>
-      <w:r>
-        <w:t xml:space="preserve"> </w:t>
-      </w:r>
-      <w:r>
-        <w:t>texto texto.</w:t>
+        <w:t xml:space="preserve">Escreva aqui a introdução do trabalho. Situe o leitor no contexto do tema pesquisado, oferecendo uma visão global do estudo, e esclareça as delimitações adotadas na abordagem do assunto. Apresente o problema investigado em linhas gerais, preparando o leitor para as seções seguintes. No último parágrafo — ou na seção opcional Estrutura do texto, ao final deste capítulo — descreva sucintamente a organização do trabalho, indicando o que será tratado em cada capítulo.</w:t>
       </w:r>
     </w:p>
     <w:p>
@@ -6163,10 +5084,84 @@
     </w:p>
     <w:p>
       <w:pPr>
-        <w:rPr>
-          <w:rFonts w:ascii="Arial" w:hAnsi="Arial" w:cs="Arial"/>
-        </w:rPr>
-      </w:pPr>
+        <w:pStyle w:val="Corpodetextook"/>
+        <w:spacing w:line="240" w:lineRule="auto"/>
+        <w:rPr>
+          <w:rFonts w:ascii="Arial" w:hAnsi="Arial" w:cs="Arial"/>
+          <w:sz w:val="20"/>
+          <w:szCs w:val="20"/>
+        </w:rPr>
+      </w:pPr>
+      <w:r>
+        <w:rPr>
+          <w:rFonts w:ascii="Arial" w:hAnsi="Arial" w:cs="Arial"/>
+          <w:b/>
+          <w:bCs/>
+          <w:sz w:val="20"/>
+          <w:szCs w:val="20"/>
+          <w:highlight w:val="yellow"/>
+        </w:rPr>
+        <w:t xml:space="preserve">COMENTÁRIO — ATENÇÃO, PLÁGIO E INTELIGÊNCIA ARTIFICIAL (Regulamento do TCC, art. 34): plágio total ou parcial ANULA o TCC e reprova o acadêmico. O uso de ferramentas de inteligência artificial para a produção do trabalho é considerado plágio. Escreva o texto com suas próprias palavras e cite e referencie TODAS as fontes utilizadas, conforme a NBR 10520.</w:t>
+      </w:r>
+    </w:p>
+    <w:p>
+      <w:pPr>
+        <w:rPr>
+          <w:rFonts w:ascii="Arial" w:hAnsi="Arial" w:cs="Arial"/>
+        </w:rPr>
+      </w:pPr>
+    </w:p>
+    <w:p>
+      <w:pPr>
+        <w:pStyle w:val="Ttulo2"/>
+      </w:pPr>
+      <w:r>
+        <w:t xml:space="preserve">Problema de pesquisa</w:t>
+      </w:r>
+    </w:p>
+    <w:p>
+      <w:r>
+        <w:t xml:space="preserve">Caracterize aqui o problema a ser pesquisado: descreva a situação atual, as dificuldades, limitações ou lacunas observadas e as consequências de não enfrentá-las, apoiando-se em dados e em fontes citadas. Delimite também o contexto em que o problema será estudado (onde, quando, com quem): um problema bem caracterizado e bem delimitado é o que torna a pesquisa viável dentro do prazo do TCC.</w:t>
+      </w:r>
+    </w:p>
+    <w:p>
+      <w:pPr>
+        <w:pStyle w:val="Ttulo3"/>
+      </w:pPr>
+      <w:r>
+        <w:t xml:space="preserve">Pergunta de pesquisa</w:t>
+      </w:r>
+    </w:p>
+    <w:p>
+      <w:r>
+        <w:t xml:space="preserve">A pergunta de pesquisa é a síntese do problema em forma interrogativa. Formule-a aqui em uma única frase clara e delimitada — por exemplo: “em que medida a técnica X melhora o aspecto Y no contexto Z?”. Todos os capítulos seguintes devem contribuir para respondê-la.</w:t>
+      </w:r>
+    </w:p>
+    <w:p>
+      <w:pPr>
+        <w:pStyle w:val="Ttulo3"/>
+      </w:pPr>
+      <w:r>
+        <w:t xml:space="preserve">Hipótese de pesquisa - Opcional</w:t>
+      </w:r>
+    </w:p>
+    <w:p>
+      <w:r>
+        <w:t xml:space="preserve">Enuncie aqui a resposta provisória à pergunta de pesquisa, que será confirmada ou refutada pelos resultados do trabalho. A hipótese deve ser verificável: evite afirmações vagas, que não possam ser testadas. Por ser um elemento opcional, remova esta subseção caso o seu trabalho não utilize hipótese.</w:t>
+      </w:r>
+    </w:p>
+    <w:p>
+      <w:pPr>
+        <w:pStyle w:val="Ttulo2"/>
+      </w:pPr>
+      <w:r>
+        <w:t xml:space="preserve">Justificativa</w:t>
+      </w:r>
+    </w:p>
+    <w:p>
+      <w:r>
+        <w:t xml:space="preserve">Explique aqui por que o trabalho merece ser realizado: a relevância do problema, os benefícios esperados para o público-alvo e para a área de computação e as razões que motivaram a escolha do tema. Uma boa justificativa apoia-se em dados e em fontes citadas, e não apenas na opinião do autor.</w:t>
+      </w:r>
     </w:p>
     <w:p>
       <w:pPr>
@@ -6214,40 +5209,20 @@
         <w:pStyle w:val="Ttulo3"/>
       </w:pPr>
       <w:r>
-        <w:t xml:space="preserve"> </w:t>
-      </w:r>
-      <w:bookmarkStart w:id="6" w:name="_Toc18663896"/>
-      <w:bookmarkStart w:id="7" w:name="_Toc18664070"/>
-      <w:bookmarkStart w:id="8" w:name="_Toc130901716"/>
-      <w:r>
-        <w:t>Objetivo</w:t>
-      </w:r>
-      <w:r>
-        <w:t xml:space="preserve"> Geral</w:t>
-      </w:r>
-      <w:bookmarkEnd w:id="6"/>
-      <w:bookmarkEnd w:id="7"/>
-      <w:bookmarkEnd w:id="8"/>
-    </w:p>
-    <w:p>
-      <w:pPr>
-        <w:rPr>
-          <w:rFonts w:ascii="Arial" w:hAnsi="Arial" w:cs="Arial"/>
-          <w:szCs w:val="24"/>
-        </w:rPr>
-      </w:pPr>
-    </w:p>
-    <w:p>
-      <w:r>
-        <w:t xml:space="preserve">Texto </w:t>
-      </w:r>
-      <w:proofErr w:type="gramStart"/>
-      <w:r>
-        <w:t>texto</w:t>
-      </w:r>
-      <w:proofErr w:type="gramEnd"/>
-      <w:r>
-        <w:t xml:space="preserve"> texto texto. </w:t>
+        <w:t xml:space="preserve">Objetivo geral</w:t>
+      </w:r>
+    </w:p>
+    <w:p>
+      <w:pPr>
+        <w:rPr>
+          <w:rFonts w:ascii="Arial" w:hAnsi="Arial" w:cs="Arial"/>
+          <w:szCs w:val="24"/>
+        </w:rPr>
+      </w:pPr>
+    </w:p>
+    <w:p>
+      <w:r>
+        <w:t xml:space="preserve">Enuncie aqui, em uma única frase iniciada por verbo no infinitivo (analisar, desenvolver, avaliar, comparar...), o resultado principal que o trabalho pretende alcançar, coerente com o título do trabalho e com a pergunta de pesquisa.</w:t>
       </w:r>
     </w:p>
     <w:p>
@@ -6263,20 +5238,8 @@
         <w:pStyle w:val="Ttulo3"/>
       </w:pPr>
       <w:r>
-        <w:t xml:space="preserve"> </w:t>
-      </w:r>
-      <w:bookmarkStart w:id="9" w:name="_Toc18663897"/>
-      <w:bookmarkStart w:id="10" w:name="_Toc18664071"/>
-      <w:bookmarkStart w:id="11" w:name="_Toc130901717"/>
-      <w:r>
-        <w:t>Objetivos</w:t>
-      </w:r>
-      <w:r>
-        <w:t xml:space="preserve"> Específicos</w:t>
-      </w:r>
-      <w:bookmarkEnd w:id="9"/>
-      <w:bookmarkEnd w:id="10"/>
-      <w:bookmarkEnd w:id="11"/>
+        <w:t xml:space="preserve">Objetivos específicos</w:t>
+      </w:r>
     </w:p>
     <w:p>
       <w:pPr>
@@ -6296,15 +5259,7 @@
         </w:numPr>
       </w:pPr>
       <w:r>
-        <w:t xml:space="preserve">Texto </w:t>
-      </w:r>
-      <w:proofErr w:type="gramStart"/>
-      <w:r>
-        <w:t>texto</w:t>
-      </w:r>
-      <w:proofErr w:type="gramEnd"/>
-      <w:r>
-        <w:t xml:space="preserve"> texto texto; </w:t>
+        <w:t xml:space="preserve">enunciar cada etapa que, somada às demais, conduz ao objetivo geral;</w:t>
       </w:r>
     </w:p>
     <w:p>
@@ -6316,15 +5271,7 @@
         </w:numPr>
       </w:pPr>
       <w:r>
-        <w:t xml:space="preserve">Texto </w:t>
-      </w:r>
-      <w:proofErr w:type="gramStart"/>
-      <w:r>
-        <w:t>texto</w:t>
-      </w:r>
-      <w:proofErr w:type="gramEnd"/>
-      <w:r>
-        <w:t xml:space="preserve"> texto texto; </w:t>
+        <w:t xml:space="preserve">iniciar cada item por verbo no infinitivo (levantar, implementar, testar...);</w:t>
       </w:r>
     </w:p>
     <w:p>
@@ -6336,15 +5283,7 @@
         </w:numPr>
       </w:pPr>
       <w:r>
-        <w:t xml:space="preserve">Texto </w:t>
-      </w:r>
-      <w:proofErr w:type="gramStart"/>
-      <w:r>
-        <w:t>texto</w:t>
-      </w:r>
-      <w:proofErr w:type="gramEnd"/>
-      <w:r>
-        <w:t xml:space="preserve"> texto texto. </w:t>
+        <w:t xml:space="preserve">manter entre três e cinco objetivos específicos, verificáveis ao final do trabalho.</w:t>
       </w:r>
     </w:p>
     <w:p>
@@ -6379,6 +5318,19 @@
     </w:p>
     <w:p>
       <w:pPr>
+        <w:pStyle w:val="Ttulo2"/>
+      </w:pPr>
+      <w:r>
+        <w:t xml:space="preserve">Estrutura do texto - Opcional</w:t>
+      </w:r>
+    </w:p>
+    <w:p>
+      <w:r>
+        <w:t xml:space="preserve">Apresente aqui, caso já não o tenha feito no último parágrafo da introdução, a organização do texto: um parágrafo indicando, capítulo a capítulo, o que o leitor encontrará — por exemplo: “o Capítulo 2 apresenta a fundamentação teórica; o Capítulo 3 discute os trabalhos relacionados; o Capítulo 4 descreve a metodologia; o Capítulo 5 apresenta e discute os resultados; e o Capítulo 6 traz as conclusões e os trabalhos futuros”. Utilize apenas um dos dois lugares (o parágrafo final da introdução ou esta seção) e remova o outro.</w:t>
+      </w:r>
+    </w:p>
+    <w:p>
+      <w:pPr>
         <w:pStyle w:val="Ttulo1"/>
       </w:pPr>
       <w:r>
@@ -6534,7 +5486,7 @@
       </w:r>
       <w:proofErr w:type="gramEnd"/>
       <w:r>
-        <w:t xml:space="preserve"> texto texto texto texto texto texto texto texto texto texto texto texto texto texto texto texto texto texto texto texto texto texto texto texto texto texto texto texto texto texto texto texto texto texto texto. (SOBRENOME, 2010, p. 13)</w:t>
+        <w:t xml:space="preserve"> texto texto texto texto texto texto texto texto texto texto texto texto texto texto texto texto texto texto texto texto texto texto texto texto texto texto texto texto texto texto texto texto texto texto texto. (Sobrenome, 2010, p. 13)</w:t>
       </w:r>
       <w:r>
         <w:t>.</w:t>
@@ -6657,153 +5609,7 @@
     <w:p/>
     <w:p>
       <w:r>
-        <w:t xml:space="preserve">Texto </w:t>
-      </w:r>
-      <w:proofErr w:type="gramStart"/>
-      <w:r>
-        <w:t>texto</w:t>
-      </w:r>
-      <w:proofErr w:type="gramEnd"/>
-      <w:r>
-        <w:t xml:space="preserve"> texto texto texto texto texto texto</w:t>
-      </w:r>
-      <w:r>
-        <w:t xml:space="preserve"> </w:t>
-      </w:r>
-      <w:r>
-        <w:t>texto texto texto</w:t>
-      </w:r>
-      <w:r>
-        <w:t xml:space="preserve"> </w:t>
-      </w:r>
-      <w:r>
-        <w:t>texto texto texto</w:t>
-      </w:r>
-      <w:r>
-        <w:t xml:space="preserve"> </w:t>
-      </w:r>
-      <w:r>
-        <w:t>texto texto texto</w:t>
-      </w:r>
-      <w:r>
-        <w:t xml:space="preserve"> </w:t>
-      </w:r>
-      <w:r>
-        <w:t>texto texto texto</w:t>
-      </w:r>
-      <w:r>
-        <w:t xml:space="preserve"> </w:t>
-      </w:r>
-      <w:r>
-        <w:t>texto texto texto</w:t>
-      </w:r>
-      <w:r>
-        <w:t xml:space="preserve"> </w:t>
-      </w:r>
-      <w:r>
-        <w:t>texto texto texto</w:t>
-      </w:r>
-      <w:r>
-        <w:t xml:space="preserve"> </w:t>
-      </w:r>
-      <w:r>
-        <w:t>texto texto texto</w:t>
-      </w:r>
-      <w:r>
-        <w:t xml:space="preserve"> </w:t>
-      </w:r>
-      <w:r>
-        <w:t>texto texto texto</w:t>
-      </w:r>
-      <w:r>
-        <w:t xml:space="preserve"> </w:t>
-      </w:r>
-      <w:r>
-        <w:t>texto texto texto</w:t>
-      </w:r>
-      <w:r>
-        <w:t xml:space="preserve"> </w:t>
-      </w:r>
-      <w:r>
-        <w:t>texto texto texto</w:t>
-      </w:r>
-      <w:r>
-        <w:t xml:space="preserve"> </w:t>
-      </w:r>
-      <w:r>
-        <w:t>texto texto texto</w:t>
-      </w:r>
-      <w:r>
-        <w:t xml:space="preserve"> </w:t>
-      </w:r>
-      <w:r>
-        <w:t>texto texto texto</w:t>
-      </w:r>
-      <w:r>
-        <w:t xml:space="preserve"> </w:t>
-      </w:r>
-      <w:r>
-        <w:t>texto texto texto</w:t>
-      </w:r>
-      <w:r>
-        <w:t xml:space="preserve"> </w:t>
-      </w:r>
-      <w:r>
-        <w:t>texto texto texto</w:t>
-      </w:r>
-      <w:r>
-        <w:t xml:space="preserve"> </w:t>
-      </w:r>
-      <w:r>
-        <w:t>texto texto texto</w:t>
-      </w:r>
-      <w:r>
-        <w:t xml:space="preserve"> </w:t>
-      </w:r>
-      <w:r>
-        <w:t>texto texto texto</w:t>
-      </w:r>
-      <w:r>
-        <w:t xml:space="preserve"> </w:t>
-      </w:r>
-      <w:r>
-        <w:t>texto texto texto</w:t>
-      </w:r>
-      <w:r>
-        <w:t xml:space="preserve"> </w:t>
-      </w:r>
-      <w:r>
-        <w:t>texto texto texto</w:t>
-      </w:r>
-      <w:r>
-        <w:t xml:space="preserve"> </w:t>
-      </w:r>
-      <w:r>
-        <w:t>texto texto texto</w:t>
-      </w:r>
-      <w:r>
-        <w:t xml:space="preserve"> </w:t>
-      </w:r>
-      <w:r>
-        <w:t>texto texto texto</w:t>
-      </w:r>
-      <w:r>
-        <w:t xml:space="preserve"> </w:t>
-      </w:r>
-      <w:r>
-        <w:t>texto texto texto</w:t>
-      </w:r>
-      <w:r>
-        <w:t xml:space="preserve"> </w:t>
-      </w:r>
-      <w:r>
-        <w:t>texto texto texto</w:t>
-      </w:r>
-      <w:r>
-        <w:t xml:space="preserve"> </w:t>
-      </w:r>
-      <w:r>
-        <w:t>texto texto texto.</w:t>
+        <w:t xml:space="preserve">Aprofunde aqui um tópico específico da seção anterior. Evite seções de um único parágrafo e lembre-se: a norma exige texto entre o título de uma seção e o título da seção seguinte.</w:t>
       </w:r>
     </w:p>
     <w:p>
@@ -6865,7 +5671,7 @@
           <w:szCs w:val="20"/>
           <w:highlight w:val="yellow"/>
         </w:rPr>
-        <w:t xml:space="preserve">Esta seção deve ser subdividida em subseções, nomeadas de acordo com os assuntos a serem tratados. Não há um limite máximo ou mínimo de seção a ser utilizado no trabalho. Cabe a cada autor definir a quantidade que melhor atenda à sua necessidade. </w:t>
+        <w:t xml:space="preserve">Esta seção deve ser subdividida em subseções, nomeadas de acordo com os assuntos a serem tratados. Não há um limite máximo ou mínimo de seção a ser utilizado no trabalho. Cabe a cada autor definir a quantidade que melhor atenda à sua necessidade. Em trabalhos de desenvolvimento de um sistema (Regulamento do TCC, art. 5º, natureza IV), pode-se incluir antes desta seção um capítulo DESENVOLVIMENTO (requisitos funcionais e não funcionais, modelagem, arquitetura, tecnologias e implementação) e apresentar aqui os testes (unitários, integração, aceitação), os cenários e a validação com usuários ou especialistas. O código-fonte completo não deve ser transcrito na monografia: disponibilize-o em um repositório e indique o endereço no texto ou em apêndice — a entrega da cópia integral dos códigos é obrigatória (art. 23). </w:t>
       </w:r>
       <w:r>
         <w:rPr>
@@ -7181,7 +5987,7 @@
           <w:szCs w:val="20"/>
           <w:highlight w:val="yellow"/>
         </w:rPr>
-        <w:t>Exemplo: Mousnier (1960 apud CHALITA, 1999, p.36), “[...] a alegria consiste na força, o sentimento de existir proporcionado pela ação, desta dilataçã</w:t>
+        <w:t>Exemplo: Mousnier (1960 apud Chalita, 1999, p. 36), “[...] a alegria consiste na força, o sentimento de existir proporcionado pela ação, desta dilataçã</w:t>
       </w:r>
       <w:r>
         <w:rPr>
@@ -7210,16 +6016,16 @@
           <w:szCs w:val="20"/>
           <w:highlight w:val="yellow"/>
         </w:rPr>
-        <w:t xml:space="preserve">, ou (MOUSNIER, 1960 apud </w:t>
-      </w:r>
-      <w:r>
-        <w:rPr>
-          <w:rFonts w:ascii="Arial" w:hAnsi="Arial" w:cs="Arial"/>
-          <w:sz w:val="20"/>
-          <w:szCs w:val="20"/>
-          <w:highlight w:val="yellow"/>
-        </w:rPr>
-        <w:t>CHALITA, 1999, p.36</w:t>
+        <w:t xml:space="preserve">, ou (Mousnier, 1960 apud </w:t>
+      </w:r>
+      <w:r>
+        <w:rPr>
+          <w:rFonts w:ascii="Arial" w:hAnsi="Arial" w:cs="Arial"/>
+          <w:sz w:val="20"/>
+          <w:szCs w:val="20"/>
+          <w:highlight w:val="yellow"/>
+        </w:rPr>
+        <w:t>Chalita, 1999, p. 36</w:t>
       </w:r>
       <w:r>
         <w:rPr>
@@ -7286,7 +6092,7 @@
       <w:bookmarkStart w:id="24" w:name="_Toc130901721"/>
       <w:r>
         <w:lastRenderedPageBreak/>
-        <w:t>METODOLOGIA</w:t>
+        <w:t>TRABALHOS RELACIONADOS</w:t>
       </w:r>
       <w:bookmarkEnd w:id="24"/>
       <w:r>
@@ -7296,154 +6102,69 @@
       <w:bookmarkEnd w:id="23"/>
     </w:p>
     <w:p>
-      <w:pPr>
-        <w:rPr>
-          <w:rFonts w:ascii="Arial" w:hAnsi="Arial" w:cs="Arial"/>
-          <w:szCs w:val="24"/>
-        </w:rPr>
-      </w:pPr>
-    </w:p>
-    <w:p>
-      <w:r>
-        <w:t>Texto texto texto texto texto texto texto texto</w:t>
-      </w:r>
+      <w:r>
+        <w:t xml:space="preserve">Descreva aqui cada trabalho relacionado, um por parágrafo ou seção, sempre com citação da fonte: o que o trabalho faz, em que contexto foi aplicado e que resultados obteve.</w:t>
+      </w:r>
+    </w:p>
+    <w:p>
+      <w:r>
+        <w:t xml:space="preserve">Ao descrever cada proposta, destaque o que a aproxima e o que a diferencia do seu trabalho, bem como as limitações que o seu trabalho pretende superar.</w:t>
+      </w:r>
+    </w:p>
+    <w:p>
+      <w:r>
+        <w:t xml:space="preserve">Ao final, compare os trabalhos relacionados em um quadro, incluindo o seu próprio trabalho na última linha.</w:t>
+      </w:r>
+    </w:p>
+    <w:p>
+      <w:pPr>
+        <w:pStyle w:val="Corpodetextook"/>
+        <w:spacing w:line="240" w:lineRule="auto"/>
+        <w:rPr>
+          <w:rFonts w:ascii="Arial" w:hAnsi="Arial" w:cs="Arial"/>
+          <w:sz w:val="20"/>
+          <w:szCs w:val="20"/>
+        </w:rPr>
+      </w:pPr>
+      <w:r>
+        <w:rPr>
+          <w:rFonts w:ascii="Arial" w:hAnsi="Arial" w:cs="Arial"/>
+          <w:b/>
+          <w:bCs/>
+          <w:sz w:val="20"/>
+          <w:szCs w:val="20"/>
+          <w:highlight w:val="yellow"/>
+        </w:rPr>
+        <w:t xml:space="preserve">COMENTÁRIO: apresente os sistemas, ferramentas ou estudos semelhantes ao seu (obtidos no levantamento bibliográfico), descrevendo cada um em uma seção ou parágrafo, sempre com citação da fonte. Ao final, compare-os em um quadro, incluindo o seu próprio trabalho na última linha: é essa comparação que evidencia a lacuna que o seu trabalho preenche e o seu diferencial. A atualidade e a relevância da bibliografia são critérios de avaliação da banca (Regulamento do TCC, art. 32). Evite usar somente comparações binárias (Sim – Não, Tem – Não Tem etc.).</w:t>
+      </w:r>
+    </w:p>
+    <w:p>
+      <w:pPr>
+        <w:pStyle w:val="Ttulo1"/>
+      </w:pPr>
+      <w:bookmarkStart w:id="24" w:name="_Toc130901721"/>
+      <w:r>
+        <w:lastRenderedPageBreak/>
+        <w:t>METODOLOGIA</w:t>
+      </w:r>
+      <w:bookmarkEnd w:id="24"/>
       <w:r>
         <w:t xml:space="preserve"> </w:t>
       </w:r>
-      <w:r>
-        <w:t>texto texto texto</w:t>
-      </w:r>
-      <w:r>
-        <w:t xml:space="preserve"> </w:t>
-      </w:r>
-      <w:r>
-        <w:t>texto texto texto</w:t>
-      </w:r>
-      <w:r>
-        <w:t xml:space="preserve"> </w:t>
-      </w:r>
-      <w:r>
-        <w:t>texto texto texto</w:t>
-      </w:r>
-      <w:r>
-        <w:t xml:space="preserve"> </w:t>
-      </w:r>
-      <w:r>
-        <w:t>texto texto texto</w:t>
-      </w:r>
-      <w:r>
-        <w:t xml:space="preserve"> </w:t>
-      </w:r>
-      <w:r>
-        <w:t>texto texto texto</w:t>
-      </w:r>
-      <w:r>
-        <w:t xml:space="preserve"> </w:t>
-      </w:r>
-      <w:r>
-        <w:t>texto texto texto</w:t>
-      </w:r>
-      <w:r>
-        <w:t xml:space="preserve"> </w:t>
-      </w:r>
-      <w:r>
-        <w:t>texto texto texto</w:t>
-      </w:r>
-      <w:r>
-        <w:t xml:space="preserve"> </w:t>
-      </w:r>
-      <w:r>
-        <w:t>texto texto texto</w:t>
-      </w:r>
-      <w:r>
-        <w:t xml:space="preserve"> </w:t>
-      </w:r>
-      <w:r>
-        <w:t>texto texto texto</w:t>
-      </w:r>
-      <w:r>
-        <w:t xml:space="preserve"> </w:t>
-      </w:r>
-      <w:r>
-        <w:t>texto texto texto</w:t>
-      </w:r>
-      <w:r>
-        <w:t xml:space="preserve"> </w:t>
-      </w:r>
-      <w:r>
-        <w:t>texto texto texto</w:t>
-      </w:r>
-      <w:r>
-        <w:t xml:space="preserve"> </w:t>
-      </w:r>
-      <w:r>
-        <w:t>texto texto texto</w:t>
-      </w:r>
-      <w:r>
-        <w:t xml:space="preserve"> </w:t>
-      </w:r>
-      <w:r>
-        <w:t>texto texto texto</w:t>
-      </w:r>
-      <w:r>
-        <w:t xml:space="preserve"> </w:t>
-      </w:r>
-      <w:r>
-        <w:t>texto texto texto</w:t>
-      </w:r>
-      <w:r>
-        <w:t xml:space="preserve"> </w:t>
-      </w:r>
-      <w:r>
-        <w:t>texto texto texto</w:t>
-      </w:r>
-      <w:r>
-        <w:t xml:space="preserve"> </w:t>
-      </w:r>
-      <w:r>
-        <w:t>texto texto texto</w:t>
-      </w:r>
-      <w:r>
-        <w:t xml:space="preserve"> </w:t>
-      </w:r>
-      <w:r>
-        <w:t>texto texto texto</w:t>
-      </w:r>
-      <w:r>
-        <w:t xml:space="preserve"> </w:t>
-      </w:r>
-      <w:r>
-        <w:t>texto texto texto</w:t>
-      </w:r>
-      <w:r>
-        <w:t xml:space="preserve"> </w:t>
-      </w:r>
-      <w:r>
-        <w:t>texto texto texto</w:t>
-      </w:r>
-      <w:r>
-        <w:t xml:space="preserve"> </w:t>
-      </w:r>
-      <w:r>
-        <w:t>texto texto texto</w:t>
-      </w:r>
-      <w:r>
-        <w:t xml:space="preserve"> </w:t>
-      </w:r>
-      <w:r>
-        <w:t>texto texto texto</w:t>
-      </w:r>
-      <w:r>
-        <w:t xml:space="preserve"> </w:t>
-      </w:r>
-      <w:r>
-        <w:t>texto texto texto</w:t>
-      </w:r>
-      <w:r>
-        <w:t xml:space="preserve"> </w:t>
-      </w:r>
-      <w:r>
-        <w:t>texto texto texto.</w:t>
+      <w:bookmarkEnd w:id="22"/>
+      <w:bookmarkEnd w:id="23"/>
+    </w:p>
+    <w:p>
+      <w:pPr>
+        <w:rPr>
+          <w:rFonts w:ascii="Arial" w:hAnsi="Arial" w:cs="Arial"/>
+          <w:szCs w:val="24"/>
+        </w:rPr>
+      </w:pPr>
+    </w:p>
+    <w:p>
+      <w:r>
+        <w:t xml:space="preserve">Descreva aqui como a pesquisa foi realizada, com detalhamento suficiente para que outro pesquisador possa reproduzi-la: a classificação da pesquisa, o método ou processo de desenvolvimento adotado, as tecnologias e ferramentas utilizadas e os procedimentos de coleta e de análise de dados. Ilustre o processo quando isso ajudar o leitor.</w:t>
       </w:r>
     </w:p>
     <w:p>
@@ -7480,7 +6201,7 @@
           <w:szCs w:val="20"/>
           <w:highlight w:val="yellow"/>
         </w:rPr>
-        <w:t xml:space="preserve"> Na metodologia deve-se apresentar o conjunto de métodos e técnicas utilizados para a realização da pesquisa. Define-se a classificação do tipo de pesquisa, a caracterização do campo de análise (população e amostragem), bem como os instrumentos e procedimentos de coleta e de análise de dados.</w:t>
+        <w:t xml:space="preserve"> Na metodologia deve-se apresentar o conjunto de métodos e técnicas utilizados para a realização da pesquisa. Define-se a classificação do tipo de pesquisa, a caracterização do campo de análise (população e amostragem), bem como os instrumentos e procedimentos de coleta e de análise de dados. Em trabalhos de desenvolvimento de um sistema, descreva também o método/processo de desenvolvimento adotado (ex.: iterativo, incremental, ágil), as tecnologias, linguagens, ferramentas e o ambiente utilizados e, quando houver experimentos, as métricas e o procedimento de avaliação.</w:t>
       </w:r>
       <w:r>
         <w:rPr>
@@ -7599,7 +6320,7 @@
         <w:t xml:space="preserve">Fonte: </w:t>
       </w:r>
       <w:r>
-        <w:t>Elaborado pelo autor (2022</w:t>
+        <w:t>Elaborado pelo próprio autor (2022</w:t>
       </w:r>
       <w:r>
         <w:t>)</w:t>
@@ -8232,7 +6953,7 @@
         <w:t>Fonte: Associação Bra</w:t>
       </w:r>
       <w:r>
-        <w:t>sileira de Normas Técnicas (2011</w:t>
+        <w:t>sileira de Normas Técnicas (2024</w:t>
       </w:r>
       <w:r>
         <w:t>).</w:t>
@@ -9761,301 +8482,14 @@
       <w:bookmarkStart w:id="28" w:name="_Toc130901722"/>
       <w:r>
         <w:lastRenderedPageBreak/>
-        <w:t>APRESENTAÇÃO E ANÁLISE DOS DADOS</w:t>
+        <w:t>RESULTADOS</w:t>
       </w:r>
       <w:bookmarkEnd w:id="28"/>
     </w:p>
     <w:p/>
     <w:p>
       <w:r>
-        <w:t>Texto</w:t>
-      </w:r>
-      <w:r>
-        <w:t xml:space="preserve"> </w:t>
-      </w:r>
-      <w:r>
-        <w:t>Texto texto texto texto texto texto texto texto</w:t>
-      </w:r>
-      <w:r>
-        <w:t xml:space="preserve"> </w:t>
-      </w:r>
-      <w:r>
-        <w:t>texto texto texto</w:t>
-      </w:r>
-      <w:r>
-        <w:t xml:space="preserve"> </w:t>
-      </w:r>
-      <w:r>
-        <w:t>texto texto texto</w:t>
-      </w:r>
-      <w:r>
-        <w:t xml:space="preserve"> </w:t>
-      </w:r>
-      <w:r>
-        <w:t>texto texto texto</w:t>
-      </w:r>
-      <w:r>
-        <w:t xml:space="preserve"> </w:t>
-      </w:r>
-      <w:r>
-        <w:t>texto texto texto</w:t>
-      </w:r>
-      <w:r>
-        <w:t xml:space="preserve"> </w:t>
-      </w:r>
-      <w:r>
-        <w:t>texto texto texto</w:t>
-      </w:r>
-      <w:r>
-        <w:t xml:space="preserve"> </w:t>
-      </w:r>
-      <w:r>
-        <w:t>texto texto texto</w:t>
-      </w:r>
-      <w:r>
-        <w:t xml:space="preserve"> </w:t>
-      </w:r>
-      <w:r>
-        <w:t>texto texto texto</w:t>
-      </w:r>
-      <w:r>
-        <w:t xml:space="preserve"> </w:t>
-      </w:r>
-      <w:r>
-        <w:t>texto texto texto</w:t>
-      </w:r>
-      <w:r>
-        <w:t xml:space="preserve"> </w:t>
-      </w:r>
-      <w:r>
-        <w:t>texto texto texto</w:t>
-      </w:r>
-      <w:r>
-        <w:t xml:space="preserve"> </w:t>
-      </w:r>
-      <w:r>
-        <w:t>texto texto texto</w:t>
-      </w:r>
-      <w:r>
-        <w:t xml:space="preserve"> </w:t>
-      </w:r>
-      <w:r>
-        <w:t>texto texto texto</w:t>
-      </w:r>
-      <w:r>
-        <w:t xml:space="preserve"> </w:t>
-      </w:r>
-      <w:r>
-        <w:t>texto texto texto</w:t>
-      </w:r>
-      <w:r>
-        <w:t xml:space="preserve"> </w:t>
-      </w:r>
-      <w:r>
-        <w:t>texto texto texto</w:t>
-      </w:r>
-      <w:r>
-        <w:t xml:space="preserve"> </w:t>
-      </w:r>
-      <w:r>
-        <w:t>texto texto texto</w:t>
-      </w:r>
-      <w:r>
-        <w:t xml:space="preserve"> </w:t>
-      </w:r>
-      <w:r>
-        <w:t>texto texto texto</w:t>
-      </w:r>
-      <w:r>
-        <w:t xml:space="preserve"> </w:t>
-      </w:r>
-      <w:r>
-        <w:t>texto texto texto</w:t>
-      </w:r>
-      <w:r>
-        <w:t xml:space="preserve"> </w:t>
-      </w:r>
-      <w:r>
-        <w:t>texto texto texto</w:t>
-      </w:r>
-      <w:r>
-        <w:t xml:space="preserve"> </w:t>
-      </w:r>
-      <w:r>
-        <w:t>texto texto texto</w:t>
-      </w:r>
-      <w:r>
-        <w:t xml:space="preserve"> </w:t>
-      </w:r>
-      <w:r>
-        <w:t>texto texto texto</w:t>
-      </w:r>
-      <w:r>
-        <w:t xml:space="preserve"> </w:t>
-      </w:r>
-      <w:r>
-        <w:t>texto texto texto</w:t>
-      </w:r>
-      <w:r>
-        <w:t xml:space="preserve"> </w:t>
-      </w:r>
-      <w:r>
-        <w:t>texto texto texto</w:t>
-      </w:r>
-      <w:r>
-        <w:t xml:space="preserve"> </w:t>
-      </w:r>
-      <w:r>
-        <w:t>texto texto texto</w:t>
-      </w:r>
-      <w:r>
-        <w:t xml:space="preserve"> </w:t>
-      </w:r>
-      <w:r>
-        <w:t>texto texto texto.</w:t>
-      </w:r>
-    </w:p>
-    <w:p>
-      <w:r>
-        <w:t>Texto texto texto texto texto texto texto texto</w:t>
-      </w:r>
-      <w:r>
-        <w:t xml:space="preserve"> </w:t>
-      </w:r>
-      <w:r>
-        <w:t>texto texto texto</w:t>
-      </w:r>
-      <w:r>
-        <w:t xml:space="preserve"> </w:t>
-      </w:r>
-      <w:r>
-        <w:t>texto texto texto</w:t>
-      </w:r>
-      <w:r>
-        <w:t xml:space="preserve"> </w:t>
-      </w:r>
-      <w:r>
-        <w:t>texto texto texto</w:t>
-      </w:r>
-      <w:r>
-        <w:t xml:space="preserve"> </w:t>
-      </w:r>
-      <w:r>
-        <w:t>texto texto texto</w:t>
-      </w:r>
-      <w:r>
-        <w:t xml:space="preserve"> </w:t>
-      </w:r>
-      <w:r>
-        <w:t>texto texto texto</w:t>
-      </w:r>
-      <w:r>
-        <w:t xml:space="preserve"> </w:t>
-      </w:r>
-      <w:r>
-        <w:t>texto texto texto</w:t>
-      </w:r>
-      <w:r>
-        <w:t xml:space="preserve"> </w:t>
-      </w:r>
-      <w:r>
-        <w:t>texto texto texto</w:t>
-      </w:r>
-      <w:r>
-        <w:t xml:space="preserve"> </w:t>
-      </w:r>
-      <w:r>
-        <w:t>texto texto texto</w:t>
-      </w:r>
-      <w:r>
-        <w:t xml:space="preserve"> </w:t>
-      </w:r>
-      <w:r>
-        <w:t>texto texto texto</w:t>
-      </w:r>
-      <w:r>
-        <w:t xml:space="preserve"> </w:t>
-      </w:r>
-      <w:r>
-        <w:t>texto texto texto</w:t>
-      </w:r>
-      <w:r>
-        <w:t xml:space="preserve"> </w:t>
-      </w:r>
-      <w:r>
-        <w:t>texto texto texto</w:t>
-      </w:r>
-      <w:r>
-        <w:t xml:space="preserve"> </w:t>
-      </w:r>
-      <w:r>
-        <w:t>texto texto texto</w:t>
-      </w:r>
-      <w:r>
-        <w:t xml:space="preserve"> </w:t>
-      </w:r>
-      <w:r>
-        <w:t>texto texto texto</w:t>
-      </w:r>
-      <w:r>
-        <w:t xml:space="preserve"> </w:t>
-      </w:r>
-      <w:r>
-        <w:t>texto texto texto</w:t>
-      </w:r>
-      <w:r>
-        <w:t xml:space="preserve"> </w:t>
-      </w:r>
-      <w:r>
-        <w:t>texto texto texto</w:t>
-      </w:r>
-      <w:r>
-        <w:t xml:space="preserve"> </w:t>
-      </w:r>
-      <w:r>
-        <w:t>texto texto texto</w:t>
-      </w:r>
-      <w:r>
-        <w:t xml:space="preserve"> </w:t>
-      </w:r>
-      <w:r>
-        <w:t>texto texto texto</w:t>
-      </w:r>
-      <w:r>
-        <w:t xml:space="preserve"> </w:t>
-      </w:r>
-      <w:r>
-        <w:t>texto texto texto</w:t>
-      </w:r>
-      <w:r>
-        <w:t xml:space="preserve"> </w:t>
-      </w:r>
-      <w:r>
-        <w:t>texto texto texto</w:t>
-      </w:r>
-      <w:r>
-        <w:t xml:space="preserve"> </w:t>
-      </w:r>
-      <w:r>
-        <w:t>texto texto texto</w:t>
-      </w:r>
-      <w:r>
-        <w:t xml:space="preserve"> </w:t>
-      </w:r>
-      <w:r>
-        <w:t>texto texto texto</w:t>
-      </w:r>
-      <w:r>
-        <w:t xml:space="preserve"> </w:t>
-      </w:r>
-      <w:r>
-        <w:t>texto texto texto</w:t>
-      </w:r>
-      <w:r>
-        <w:t xml:space="preserve"> </w:t>
-      </w:r>
-      <w:r>
-        <w:t>texto texto texto.</w:t>
+        <w:t xml:space="preserve">Apresente aqui os resultados obtidos e discuta-os à luz dos objetivos e da pergunta/hipótese de pesquisa — resultados sem discussão não demonstram que os objetivos foram alcançados. Use tabelas para dados numéricos e quadros para comparações qualitativas, sempre citados no texto antes de aparecerem.</w:t>
       </w:r>
     </w:p>
     <w:p/>
@@ -10170,145 +8604,7 @@
     </w:p>
     <w:p>
       <w:r>
-        <w:t>Texto texto texto texto texto texto texto texto</w:t>
-      </w:r>
-      <w:r>
-        <w:t xml:space="preserve"> </w:t>
-      </w:r>
-      <w:r>
-        <w:t>texto texto texto</w:t>
-      </w:r>
-      <w:r>
-        <w:t xml:space="preserve"> </w:t>
-      </w:r>
-      <w:r>
-        <w:t>texto texto texto</w:t>
-      </w:r>
-      <w:r>
-        <w:t xml:space="preserve"> </w:t>
-      </w:r>
-      <w:r>
-        <w:t>texto texto texto</w:t>
-      </w:r>
-      <w:r>
-        <w:t xml:space="preserve"> </w:t>
-      </w:r>
-      <w:r>
-        <w:t>texto texto texto</w:t>
-      </w:r>
-      <w:r>
-        <w:t xml:space="preserve"> </w:t>
-      </w:r>
-      <w:r>
-        <w:t>texto texto texto</w:t>
-      </w:r>
-      <w:r>
-        <w:t xml:space="preserve"> </w:t>
-      </w:r>
-      <w:r>
-        <w:t>texto texto texto</w:t>
-      </w:r>
-      <w:r>
-        <w:t xml:space="preserve"> </w:t>
-      </w:r>
-      <w:r>
-        <w:t>texto texto texto</w:t>
-      </w:r>
-      <w:r>
-        <w:t xml:space="preserve"> </w:t>
-      </w:r>
-      <w:r>
-        <w:t>texto texto texto</w:t>
-      </w:r>
-      <w:r>
-        <w:t xml:space="preserve"> </w:t>
-      </w:r>
-      <w:r>
-        <w:t>texto texto texto</w:t>
-      </w:r>
-      <w:r>
-        <w:t xml:space="preserve"> </w:t>
-      </w:r>
-      <w:r>
-        <w:t>texto texto texto</w:t>
-      </w:r>
-      <w:r>
-        <w:t xml:space="preserve"> </w:t>
-      </w:r>
-      <w:r>
-        <w:t>texto texto texto</w:t>
-      </w:r>
-      <w:r>
-        <w:t xml:space="preserve"> </w:t>
-      </w:r>
-      <w:r>
-        <w:t>texto texto texto</w:t>
-      </w:r>
-      <w:r>
-        <w:t xml:space="preserve"> </w:t>
-      </w:r>
-      <w:r>
-        <w:t>texto texto texto</w:t>
-      </w:r>
-      <w:r>
-        <w:t xml:space="preserve"> </w:t>
-      </w:r>
-      <w:r>
-        <w:t>texto texto texto</w:t>
-      </w:r>
-      <w:r>
-        <w:t xml:space="preserve"> </w:t>
-      </w:r>
-      <w:r>
-        <w:t>texto texto texto</w:t>
-      </w:r>
-      <w:r>
-        <w:t xml:space="preserve"> </w:t>
-      </w:r>
-      <w:r>
-        <w:t>texto texto texto</w:t>
-      </w:r>
-      <w:r>
-        <w:t xml:space="preserve"> </w:t>
-      </w:r>
-      <w:r>
-        <w:t>texto texto texto</w:t>
-      </w:r>
-      <w:r>
-        <w:t xml:space="preserve"> </w:t>
-      </w:r>
-      <w:r>
-        <w:t>texto texto texto</w:t>
-      </w:r>
-      <w:r>
-        <w:t xml:space="preserve"> </w:t>
-      </w:r>
-      <w:r>
-        <w:t>texto texto texto</w:t>
-      </w:r>
-      <w:r>
-        <w:t xml:space="preserve"> </w:t>
-      </w:r>
-      <w:r>
-        <w:t>texto texto texto</w:t>
-      </w:r>
-      <w:r>
-        <w:t xml:space="preserve"> </w:t>
-      </w:r>
-      <w:r>
-        <w:t>texto texto texto</w:t>
-      </w:r>
-      <w:r>
-        <w:t xml:space="preserve"> </w:t>
-      </w:r>
-      <w:r>
-        <w:t>texto texto texto</w:t>
-      </w:r>
-      <w:r>
-        <w:t xml:space="preserve"> </w:t>
-      </w:r>
-      <w:r>
-        <w:t>texto texto texto.</w:t>
+        <w:t xml:space="preserve">Retome aqui os objetivos e a pergunta/hipótese apresentados na introdução e mostre, com base nos resultados, em que medida foram alcançados ou respondidas. Sintetize as principais contribuições do trabalho, reconheça as limitações e proponha trabalhos futuros. Não apresente neste capítulo dados ou informações que não tenham aparecido antes.</w:t>
       </w:r>
     </w:p>
     <w:p>
@@ -10364,6 +8660,29 @@
     </w:p>
     <w:p>
       <w:pPr>
+        <w:pStyle w:val="Ttulo2"/>
+      </w:pPr>
+      <w:r>
+        <w:t xml:space="preserve">Declaração sobre uso de Inteligência Artificial</w:t>
+      </w:r>
+    </w:p>
+    <w:p>
+      <w:r>
+        <w:t xml:space="preserve">Declare aqui, de forma transparente, o uso de ferramentas de inteligência artificial generativa em qualquer fase do trabalho, conforme a Portaria CNPq nº 2.664/2026 (Política de Integridade na Atividade Científica). Para cada uso, especifique: (i) a ferramenta, com nome e versão; (ii) a finalidade do uso; e (iii) a fase do trabalho em que ocorreu (concepção, levantamento bibliográfico, escrita, análise de dados). Caso nenhuma ferramenta tenha sido utilizada, declare-o expressamente.</w:t>
+      </w:r>
+    </w:p>
+    <w:p>
+      <w:r>
+        <w:t xml:space="preserve">Exemplo de declaração: “durante a elaboração deste trabalho, o autor utilizou a ferramenta X (versão Y), com a finalidade de revisão gramatical e de estilo, na fase de escrita. Após o uso, todo o conteúdo foi revisado e editado pelo autor, que assume integral responsabilidade pelo conteúdo final do trabalho”.</w:t>
+      </w:r>
+    </w:p>
+    <w:p>
+      <w:r>
+        <w:t xml:space="preserve">Atenção: é vedado apresentar conteúdo gerado por IA como se fosse de autoria própria — o autor permanece integralmente responsável pelo conteúdo final, inclusive por plágio e por inexatidões produzidas pela ferramenta (Portaria CNPq nº 2.664/2026; Regulamento do TCC, art. 34).</w:t>
+      </w:r>
+    </w:p>
+    <w:p>
+      <w:pPr>
         <w:ind w:firstLine="0"/>
       </w:pPr>
     </w:p>
@@ -10427,7 +8746,7 @@
         <w:t>: informação e documentação: citações em documentos: apresentação. Rio de Janeiro</w:t>
       </w:r>
       <w:r>
-        <w:t>: ABNT, 2002.</w:t>
+        <w:t>: ABNT, 2023.</w:t>
       </w:r>
     </w:p>
     <w:p>
@@ -10576,6 +8895,34 @@
       </w:r>
       <w:r>
         <w:t>resumo, resenha e recensão: apresentação. Rio de Janeiro: ABNT, 2021.</w:t>
+      </w:r>
+    </w:p>
+    <w:p>
+      <w:pPr>
+        <w:spacing w:line="240" w:lineRule="auto"/>
+        <w:ind w:firstLine="0"/>
+        <w:jc w:val="left"/>
+      </w:pPr>
+      <w:r>
+        <w:t xml:space="preserve">ASSOCIAÇÃO BRASILEIRA DE NORMAS TÉCNICAS. </w:t>
+      </w:r>
+      <w:r>
+        <w:rPr>
+          <w:b/>
+        </w:rPr>
+        <w:t xml:space="preserve">NBR </w:t>
+      </w:r>
+      <w:r>
+        <w:rPr>
+          <w:b/>
+        </w:rPr>
+        <w:t>14724</w:t>
+      </w:r>
+      <w:r>
+        <w:t xml:space="preserve">: informação e documentação: </w:t>
+      </w:r>
+      <w:r>
+        <w:t>trabalhos acadêmicos: apresentação. Rio de Janeiro: ABNT, 2024.</w:t>
       </w:r>
     </w:p>
     <w:p>
@@ -10649,7 +8996,7 @@
           <w:sz w:val="20"/>
           <w:szCs w:val="20"/>
         </w:rPr>
-        <w:t xml:space="preserve"> conforme a ABNT NBR 6023. As referências devem ser elaboradas em espaço simples, alinhadas à margem esquerda do texto e separadas entre si por uma linha em branco de espaço simples. Recomenda-se o uso do gerador de referência disponível em: </w:t>
+        <w:t xml:space="preserve"> conforme a ABNT NBR 6023. As referências devem ser elaboradas em espaço simples, alinhadas à margem esquerda do texto e separadas entre si por uma linha em branco de espaço simples. Escreva os autores no formato "ÚLTIMO SOBRENOME, Inicial do primeiro nome" — por exemplo, Alex Mulattieri Suarez Orozco fica OROZCO, A. Entrada por tipo de sobrenome: simples — pelo último (SILVA, A.); composto mantém os dois (CASTELO BRANCO, A.); prefixo de/da/do/von/van vai após o nome e não integra o sobrenome (MOTA, A. de); Filho, Neto e Júnior integram o sobrenome (OLIVEIRA FILHO, J.); sobrenome com hífen é único (TELES-PONTES, G.); autora com sobrenome do cônjuge: manter a forma que ela usa habitualmente; estrangeiro segue a convenção do país de origem (GARCÍA LÓPEZ, M.); em nomes chineses, japoneses e coreanos o sobrenome já vem primeiro (Mao Zedong → MAO, Z.). Recomenda-se o uso do gerador de referência disponível em: </w:t>
       </w:r>
       <w:hyperlink r:id="rId16" w:history="1">
         <w:r>
@@ -10675,6 +9022,313 @@
     <w:p>
       <w:pPr>
         <w:pStyle w:val="Corpodetextook"/>
+        <w:spacing w:line="240" w:lineRule="auto"/>
+        <w:rPr>
+          <w:rFonts w:ascii="Arial" w:hAnsi="Arial" w:cs="Arial"/>
+          <w:sz w:val="20"/>
+          <w:szCs w:val="20"/>
+        </w:rPr>
+      </w:pPr>
+      <w:r>
+        <w:rPr>
+          <w:rFonts w:ascii="Arial" w:hAnsi="Arial" w:cs="Arial"/>
+          <w:b/>
+          <w:bCs/>
+          <w:sz w:val="20"/>
+          <w:szCs w:val="20"/>
+          <w:highlight w:val="yellow"/>
+        </w:rPr>
+        <w:t xml:space="preserve">COMENTÁRIO: os exemplos a seguir demonstram a formatação dos principais tipos de referência usados em trabalhos de computação, conforme a NBR 6023:2025: livro, capítulo de livro, artigo de periódico (com DOI em forma de URL completa), trabalho em anais de evento, monografia, trabalho de conclusão de curso, dissertação, tese, norma técnica, legislação, portaria, software, página de site, vídeo e podcast. Todas as entradas abaixo são obras reais, verificadas nas fontes. Substitua-as pelas obras efetivamente citadas no seu texto — a lista final deve conter somente o que foi citado.</w:t>
+      </w:r>
+    </w:p>
+    <w:p>
+      <w:pPr>
+        <w:spacing w:line="240" w:lineRule="auto"/>
+        <w:ind w:firstLine="0"/>
+        <w:jc w:val="left"/>
+      </w:pPr>
+      <w:r>
+        <w:t xml:space="preserve">ASSOCIAÇÃO BRASILEIRA DE NORMAS TÉCNICAS. </w:t>
+      </w:r>
+      <w:r>
+        <w:rPr>
+          <w:b/>
+        </w:rPr>
+        <w:t xml:space="preserve">ABNT NBR ISO/IEC 25010</w:t>
+      </w:r>
+      <w:r>
+        <w:t xml:space="preserve">: engenharia de sistemas e software — requisitos e avaliação da qualidade de sistemas e software (SQuaRE) — modelos de qualidade de sistemas e software. Rio de Janeiro: ABNT, 2011.</w:t>
+      </w:r>
+    </w:p>
+    <w:p>
+      <w:pPr>
+        <w:spacing w:line="240" w:lineRule="auto"/>
+        <w:ind w:firstLine="0"/>
+        <w:jc w:val="left"/>
+      </w:pPr>
+      <w:r>
+        <w:t xml:space="preserve">BERNERS-LEE, T. </w:t>
+      </w:r>
+      <w:r>
+        <w:rPr>
+          <w:b/>
+        </w:rPr>
+        <w:t xml:space="preserve">The next web</w:t>
+      </w:r>
+      <w:r>
+        <w:t xml:space="preserve">. 2009. Vídeo (16 min). Palestra TED. Disponível em: https://www.ted.com/talks/tim_berners_lee_the_next_web. Acesso em: 7 jul. 2026.</w:t>
+      </w:r>
+    </w:p>
+    <w:p>
+      <w:pPr>
+        <w:spacing w:line="240" w:lineRule="auto"/>
+        <w:ind w:firstLine="0"/>
+        <w:jc w:val="left"/>
+      </w:pPr>
+      <w:r>
+        <w:t xml:space="preserve">BRASIL. </w:t>
+      </w:r>
+      <w:r>
+        <w:rPr>
+          <w:b/>
+        </w:rPr>
+        <w:t xml:space="preserve">Lei nº 13.709, de 14 de agosto de 2018</w:t>
+      </w:r>
+      <w:r>
+        <w:t xml:space="preserve">: Lei Geral de Proteção de Dados Pessoais (LGPD). 2018. Disponível em: https://www.planalto.gov.br/ccivil_03/_ato2015-2018/2018/lei/l13709.htm. Acesso em: 7 jul. 2026.</w:t>
+      </w:r>
+    </w:p>
+    <w:p>
+      <w:pPr>
+        <w:spacing w:line="240" w:lineRule="auto"/>
+        <w:ind w:firstLine="0"/>
+        <w:jc w:val="left"/>
+      </w:pPr>
+      <w:r>
+        <w:t xml:space="preserve">CONSELHO NACIONAL DE DESENVOLVIMENTO CIENTÍFICO E TECNOLÓGICO – CNPq. </w:t>
+      </w:r>
+      <w:r>
+        <w:rPr>
+          <w:b/>
+        </w:rPr>
+        <w:t xml:space="preserve">Portaria nº 2.664, de 6 de março de 2026</w:t>
+      </w:r>
+      <w:r>
+        <w:t xml:space="preserve">: institui a Política de Integridade na Atividade Científica do CNPq. 2026. Disponível em: http://memoria2.cnpq.br/web/guest/view/-/journal_content/56_INSTANCE_0oED/10157/23142775. Acesso em: 7 jul. 2026.</w:t>
+      </w:r>
+    </w:p>
+    <w:p>
+      <w:pPr>
+        <w:spacing w:line="240" w:lineRule="auto"/>
+        <w:ind w:firstLine="0"/>
+        <w:jc w:val="left"/>
+      </w:pPr>
+      <w:r>
+        <w:t xml:space="preserve">COSTA, J. </w:t>
+      </w:r>
+      <w:r>
+        <w:rPr>
+          <w:b/>
+        </w:rPr>
+        <w:t xml:space="preserve">Uma análise sobre o impacto de dados faltantes no desempenho de métodos de aprendizado de máquina</w:t>
+      </w:r>
+      <w:r>
+        <w:t xml:space="preserve">. 2019. 55 p. Dissertação (Mestrado em Ciência da Computação) — Universidade Federal do Ceará, Fortaleza. Disponível em: https://repositorio.ufc.br/handle/riufc/41653. Acesso em: 7 jul. 2026.</w:t>
+      </w:r>
+    </w:p>
+    <w:p>
+      <w:pPr>
+        <w:spacing w:line="240" w:lineRule="auto"/>
+        <w:ind w:firstLine="0"/>
+        <w:jc w:val="left"/>
+      </w:pPr>
+      <w:r>
+        <w:t xml:space="preserve">DIJKSTRA, E. Go to statement considered harmful. </w:t>
+      </w:r>
+      <w:r>
+        <w:rPr>
+          <w:b/>
+        </w:rPr>
+        <w:t xml:space="preserve">Communications of the ACM</w:t>
+      </w:r>
+      <w:r>
+        <w:t xml:space="preserve">, New York, v. 11, n. 3, p. 147-148, 1968. Disponível em: https://doi.org/10.1145/362929.362947. Acesso em: 7 jul. 2026.</w:t>
+      </w:r>
+    </w:p>
+    <w:p>
+      <w:pPr>
+        <w:spacing w:line="240" w:lineRule="auto"/>
+        <w:ind w:firstLine="0"/>
+        <w:jc w:val="left"/>
+      </w:pPr>
+      <w:r>
+        <w:t xml:space="preserve">GARCIA, F. </w:t>
+      </w:r>
+      <w:r>
+        <w:rPr>
+          <w:b/>
+        </w:rPr>
+        <w:t xml:space="preserve">EPMOSt: um sistema de monitoramento passivo energeticamente eficiente para redes de sensores sem fio</w:t>
+      </w:r>
+      <w:r>
+        <w:t xml:space="preserve">. 2014. 115 p. Tese (Doutorado em Ciência da Computação) — Universidade Federal do Ceará, Fortaleza. Disponível em: https://repositorio.ufc.br/handle/riufc/18675. Acesso em: 7 jul. 2026.</w:t>
+      </w:r>
+    </w:p>
+    <w:p>
+      <w:pPr>
+        <w:spacing w:line="240" w:lineRule="auto"/>
+        <w:ind w:firstLine="0"/>
+        <w:jc w:val="left"/>
+      </w:pPr>
+      <w:r>
+        <w:t xml:space="preserve">GOODFELLOW, I.; BENGIO, Y.; COURVILLE, A. </w:t>
+      </w:r>
+      <w:r>
+        <w:rPr>
+          <w:b/>
+        </w:rPr>
+        <w:t xml:space="preserve">Deep learning</w:t>
+      </w:r>
+      <w:r>
+        <w:t xml:space="preserve">. Cambridge: MIT Press, 2016. Disponível em: https://www.deeplearningbook.org/. Acesso em: 7 jul. 2026.</w:t>
+      </w:r>
+    </w:p>
+    <w:p>
+      <w:pPr>
+        <w:spacing w:line="240" w:lineRule="auto"/>
+        <w:ind w:firstLine="0"/>
+        <w:jc w:val="left"/>
+      </w:pPr>
+      <w:r>
+        <w:t xml:space="preserve">GUANABARA, G. </w:t>
+      </w:r>
+      <w:r>
+        <w:rPr>
+          <w:b/>
+        </w:rPr>
+        <w:t xml:space="preserve">Inteligência artificial com Guanabara</w:t>
+      </w:r>
+      <w:r>
+        <w:t xml:space="preserve">. 2024. Entrevista concedida ao podcast Hipsters Ponto Tech, episódio 426. Podcast. Disponível em: https://www.alura.com.br/podcast/inteligencia-artificial-com-guanabara-hipsters-ponto-tech-426-a9408. Acesso em: 7 jul. 2026.</w:t>
+      </w:r>
+    </w:p>
+    <w:p>
+      <w:pPr>
+        <w:spacing w:line="240" w:lineRule="auto"/>
+        <w:ind w:firstLine="0"/>
+        <w:jc w:val="left"/>
+      </w:pPr>
+      <w:r>
+        <w:t xml:space="preserve">MICHELS, J.; CASSANHO, L.; BURIGO, B.; BARBOSA, C. de. Avaliação do JFLAP como ferramenta de ensino de gramáticas na disciplina de Linguagens Formais e Autômatos. In: SIMPÓSIO BRASILEIRO DE INFORMÁTICA NA EDUCAÇÃO, 35., 2024, Rio de Janeiro. </w:t>
+      </w:r>
+      <w:r>
+        <w:rPr>
+          <w:b/>
+        </w:rPr>
+        <w:t xml:space="preserve">Anais</w:t>
+      </w:r>
+      <w:r>
+        <w:t xml:space="preserve"> [...]. Porto Alegre: SBC, 2024. p. 199-209. Disponível em: https://doi.org/10.5753/sbie.2024.242335. Acesso em: 7 jul. 2026.</w:t>
+      </w:r>
+    </w:p>
+    <w:p>
+      <w:pPr>
+        <w:spacing w:line="240" w:lineRule="auto"/>
+        <w:ind w:firstLine="0"/>
+        <w:jc w:val="left"/>
+      </w:pPr>
+      <w:r>
+        <w:t xml:space="preserve">NOBRE, I. </w:t>
+      </w:r>
+      <w:r>
+        <w:rPr>
+          <w:b/>
+        </w:rPr>
+        <w:t xml:space="preserve">Um mapeamento da usabilidade em modelos e normas de qualidade de software</w:t>
+      </w:r>
+      <w:r>
+        <w:t xml:space="preserve">. 2017. 60 p. Trabalho de Conclusão de Curso (Bacharelado em Engenharia de Software) — Universidade Federal do Ceará, Campus Quixadá, Quixadá. Disponível em: https://repositorio.ufc.br/handle/riufc/29555. Acesso em: 7 jul. 2026.</w:t>
+      </w:r>
+    </w:p>
+    <w:p>
+      <w:pPr>
+        <w:spacing w:line="240" w:lineRule="auto"/>
+        <w:ind w:firstLine="0"/>
+        <w:jc w:val="left"/>
+      </w:pPr>
+      <w:r>
+        <w:t xml:space="preserve">PIMENTEL, M.; GEROSA, M.; FUKS, H. Sistemas de comunicação para colaboração. In: PIMENTEL, M.; FUKS, H. (org.). </w:t>
+      </w:r>
+      <w:r>
+        <w:rPr>
+          <w:b/>
+        </w:rPr>
+        <w:t xml:space="preserve">Sistemas colaborativos</w:t>
+      </w:r>
+      <w:r>
+        <w:t xml:space="preserve">. Rio de Janeiro: Elsevier, 2011. Cap. 5. Disponível em: https://sistemascolaborativos.uniriotec.br/wp-content/uploads/sites/18/2019/06/SC-cap5-comunicacao.pdf. Acesso em: 7 jul. 2026.</w:t>
+      </w:r>
+    </w:p>
+    <w:p>
+      <w:pPr>
+        <w:spacing w:line="240" w:lineRule="auto"/>
+        <w:ind w:firstLine="0"/>
+        <w:jc w:val="left"/>
+      </w:pPr>
+      <w:r>
+        <w:t xml:space="preserve">PYTHON SOFTWARE FOUNDATION. </w:t>
+      </w:r>
+      <w:r>
+        <w:rPr>
+          <w:b/>
+        </w:rPr>
+        <w:t xml:space="preserve">Python</w:t>
+      </w:r>
+      <w:r>
+        <w:t xml:space="preserve">. 2025. Versão 3.13. Software. Disponível em: https://www.python.org/. Acesso em: 7 jul. 2026.</w:t>
+      </w:r>
+    </w:p>
+    <w:p>
+      <w:pPr>
+        <w:spacing w:line="240" w:lineRule="auto"/>
+        <w:ind w:firstLine="0"/>
+        <w:jc w:val="left"/>
+      </w:pPr>
+      <w:r>
+        <w:t xml:space="preserve">STACK OVERFLOW. </w:t>
+      </w:r>
+      <w:r>
+        <w:rPr>
+          <w:b/>
+        </w:rPr>
+        <w:t xml:space="preserve">2025 developer survey</w:t>
+      </w:r>
+      <w:r>
+        <w:t xml:space="preserve">. 2025. Disponível em: https://survey.stackoverflow.co/2025. Acesso em: 7 jul. 2026.</w:t>
+      </w:r>
+    </w:p>
+    <w:p>
+      <w:pPr>
+        <w:spacing w:line="240" w:lineRule="auto"/>
+        <w:ind w:firstLine="0"/>
+        <w:jc w:val="left"/>
+      </w:pPr>
+      <w:r>
+        <w:t xml:space="preserve">TANENBAUM, A.; WETHERALL, D. </w:t>
+      </w:r>
+      <w:r>
+        <w:rPr>
+          <w:b/>
+        </w:rPr>
+        <w:t xml:space="preserve">Redes de computadores</w:t>
+      </w:r>
+      <w:r>
+        <w:t xml:space="preserve">. 5. ed. São Paulo: Pearson, 2011.</w:t>
+      </w:r>
+    </w:p>
+    <w:p>
+      <w:pPr>
+        <w:pStyle w:val="Corpodetextook"/>
       </w:pPr>
     </w:p>
     <w:p>
@@ -10760,7 +9414,7 @@
           <w:sz w:val="20"/>
           <w:szCs w:val="20"/>
         </w:rPr>
-        <w:t xml:space="preserve"> Os apêndices são documentos elaborados pelo próprio autor para complementar o texto principal. </w:t>
+        <w:t xml:space="preserve"> Os apêndices são documentos elaborados pelo próprio autor para complementar o texto principal. Conforme a NBR 14724:2024, as fontes citadas exclusivamente em apêndice devem ser referenciadas no próprio apêndice, e não na lista de referências principal. </w:t>
       </w:r>
       <w:r>
         <w:rPr>

</xml_diff>

<commit_message>
Estilos de sumário autossuficientes para atualização estável no Word
- toc 1..9 agora definem Arial 12 e cor automática (antes herdavam a
  fonte padrão Calibri, desconfigurando o sumário ao atualizar o campo)
- Preservados negritos/itálicos e tabulações pontilhadas dos estilos
- Instruções de atualização do sumário/listas mantidas para o Word
  (editor usado pelos estudantes)
- .gitignore: ignora arquivos de teste locais (tcc/teste-*)

Co-Authored-By: Claude Fable 5 <noreply@anthropic.com>
</commit_message>
<xml_diff>
--- a/tcc/exemplo-tcc.docx
+++ b/tcc/exemplo-tcc.docx
@@ -5368,173 +5368,7 @@
           <w:szCs w:val="20"/>
           <w:highlight w:val="yellow"/>
         </w:rPr>
-        <w:t xml:space="preserve">COMENTÁRIO:</w:t>
-      </w:r>
-      <w:r>
-        <w:rPr>
-          <w:rFonts w:ascii="Arial" w:hAnsi="Arial" w:cs="Arial"/>
-          <w:color w:val="ff0000"/>
-          <w:sz w:val="20"/>
-          <w:szCs w:val="20"/>
-          <w:highlight w:val="yellow"/>
-          <w:lang w:val="en-US"/>
-        </w:rPr>
-        <w:t xml:space="preserve"> </w:t>
-      </w:r>
-      <w:r>
-        <w:rPr>
-          <w:rFonts w:ascii="Arial" w:hAnsi="Arial" w:cs="Arial"/>
-          <w:color w:val="ff0000"/>
-          <w:sz w:val="20"/>
-          <w:szCs w:val="20"/>
-          <w:highlight w:val="yellow"/>
-          <w:lang w:val="en-US"/>
-        </w:rPr>
-        <w:t xml:space="preserve">ITEM OPCIONAL. </w:t>
-      </w:r>
-      <w:r>
-        <w:rPr>
-          <w:rFonts w:ascii="Arial" w:hAnsi="Arial" w:cs="Arial"/>
-          <w:color w:val="ff0000"/>
-          <w:sz w:val="20"/>
-          <w:szCs w:val="20"/>
-          <w:highlight w:val="yellow"/>
-        </w:rPr>
-        <w:t xml:space="preserve">Recomenda-se a elaboração de lista própria para cada tipo. A Lista de figuras (figuras, gravuras, desenhos, mapas e outros.) </w:t>
-      </w:r>
-      <w:r>
-        <w:rPr>
-          <w:rFonts w:ascii="Arial" w:hAnsi="Arial" w:cs="Arial"/>
-          <w:color w:val="ff0000"/>
-          <w:sz w:val="20"/>
-          <w:szCs w:val="20"/>
-          <w:highlight w:val="yellow"/>
-        </w:rPr>
-        <w:t xml:space="preserve">deve</w:t>
-      </w:r>
-      <w:r>
-        <w:rPr>
-          <w:rFonts w:ascii="Arial" w:hAnsi="Arial" w:cs="Arial"/>
-          <w:color w:val="ff0000"/>
-          <w:sz w:val="20"/>
-          <w:szCs w:val="20"/>
-          <w:highlight w:val="yellow"/>
-        </w:rPr>
-        <w:t xml:space="preserve"> ser elaborada de acordo com a ordem em que os elementos se apresentam no texto, com indicação do seu número e da página em que se encontra. A relação da Lista de figuras pode ser atualizada automaticamente, conforme os passos a seguir:</w:t>
-      </w:r>
-      <w:r>
-        <w:rPr>
-          <w:rFonts w:ascii="Arial" w:hAnsi="Arial" w:cs="Arial"/>
-          <w:color w:val="ff0000"/>
-          <w:sz w:val="20"/>
-          <w:szCs w:val="20"/>
-          <w:highlight w:val="yellow"/>
-        </w:rPr>
-        <w:t xml:space="preserve"> a) c</w:t>
-      </w:r>
-      <w:r>
-        <w:rPr>
-          <w:rFonts w:ascii="Arial" w:hAnsi="Arial" w:cs="Arial"/>
-          <w:color w:val="ff0000"/>
-          <w:sz w:val="20"/>
-          <w:szCs w:val="20"/>
-          <w:highlight w:val="yellow"/>
-        </w:rPr>
-        <w:t xml:space="preserve">lique com o botão direito do mouse sob o título </w:t>
-      </w:r>
-      <w:r>
-        <w:rPr>
-          <w:rFonts w:ascii="Arial" w:hAnsi="Arial" w:cs="Arial"/>
-          <w:color w:val="ff0000"/>
-          <w:sz w:val="20"/>
-          <w:szCs w:val="20"/>
-          <w:highlight w:val="yellow"/>
-        </w:rPr>
-        <w:t xml:space="preserve">acima </w:t>
-      </w:r>
-      <w:r>
-        <w:rPr>
-          <w:rFonts w:ascii="Arial" w:hAnsi="Arial" w:cs="Arial"/>
-          <w:i/>
-          <w:iCs/>
-          <w:color w:val="ff0000"/>
-          <w:sz w:val="20"/>
-          <w:szCs w:val="20"/>
-          <w:highlight w:val="yellow"/>
-        </w:rPr>
-        <w:t xml:space="preserve">Figura</w:t>
-      </w:r>
-      <w:r>
-        <w:rPr>
-          <w:rFonts w:ascii="Arial" w:hAnsi="Arial" w:cs="Arial"/>
-          <w:i/>
-          <w:iCs/>
-          <w:color w:val="ff0000"/>
-          <w:sz w:val="20"/>
-          <w:szCs w:val="20"/>
-          <w:highlight w:val="yellow"/>
-        </w:rPr>
-        <w:t xml:space="preserve"> 1;</w:t>
-      </w:r>
-      <w:r>
-        <w:rPr>
-          <w:rFonts w:ascii="Arial" w:hAnsi="Arial" w:cs="Arial"/>
-          <w:i/>
-          <w:iCs/>
-          <w:color w:val="ff0000"/>
-          <w:sz w:val="20"/>
-          <w:szCs w:val="20"/>
-          <w:highlight w:val="yellow"/>
-        </w:rPr>
-        <w:t xml:space="preserve"> b) c</w:t>
-      </w:r>
-      <w:r>
-        <w:rPr>
-          <w:rFonts w:ascii="Arial" w:hAnsi="Arial" w:cs="Arial"/>
-          <w:color w:val="ff0000"/>
-          <w:sz w:val="20"/>
-          <w:szCs w:val="20"/>
-          <w:highlight w:val="yellow"/>
-        </w:rPr>
-        <w:t xml:space="preserve">lique em Atualizar campo,</w:t>
-      </w:r>
-      <w:r>
-        <w:rPr>
-          <w:rFonts w:ascii="Arial" w:hAnsi="Arial" w:cs="Arial"/>
-          <w:color w:val="ff0000"/>
-          <w:sz w:val="20"/>
-          <w:szCs w:val="20"/>
-          <w:highlight w:val="yellow"/>
-        </w:rPr>
-        <w:t xml:space="preserve"> e c) clique em a</w:t>
-      </w:r>
-      <w:r>
-        <w:rPr>
-          <w:rFonts w:ascii="Arial" w:hAnsi="Arial" w:cs="Arial"/>
-          <w:color w:val="ff0000"/>
-          <w:sz w:val="20"/>
-          <w:szCs w:val="20"/>
-          <w:highlight w:val="yellow"/>
-        </w:rPr>
-        <w:t xml:space="preserve">tualizar o índice inteiro.</w:t>
-      </w:r>
-      <w:r>
-        <w:rPr>
-          <w:rFonts w:ascii="Arial" w:hAnsi="Arial" w:cs="Arial"/>
-          <w:color w:val="ff0000"/>
-          <w:sz w:val="20"/>
-          <w:szCs w:val="20"/>
-          <w:highlight w:val="yellow"/>
-        </w:rPr>
-      </w:r>
-      <w:r>
-        <w:rPr>
-          <w:rFonts w:ascii="Arial" w:hAnsi="Arial" w:cs="Arial"/>
-          <w:color w:val="ff0000"/>
-          <w:sz w:val="20"/>
-          <w:szCs w:val="20"/>
-          <w:highlight w:val="yellow"/>
-        </w:rPr>
+        <w:t xml:space="preserve">COMENTÁRIO: ITEM OPCIONAL. Recomenda-se a elaboração de lista própria para cada tipo. A Lista de Figuras (figuras, gravuras, desenhos, mapas e outros) deve ser elaborada de acordo com a ordem em que os elementos se apresentam no texto, com indicação do seu número e da página em que se encontra. A relação da Lista de Figuras pode ser atualizada automaticamente, conforme os passos a seguir: a) clique com o botão direito do mouse sob o título acima Figura 1; b) clique em Atualizar campo, e c) clique em atualizar o índice inteiro.</w:t>
       </w:r>
     </w:p>
     <w:p>
@@ -7471,185 +7305,7 @@
           <w:szCs w:val="20"/>
           <w:highlight w:val="yellow"/>
         </w:rPr>
-        <w:t xml:space="preserve">COMENTÁRIO:</w:t>
-      </w:r>
-      <w:r>
-        <w:rPr>
-          <w:rFonts w:ascii="Arial" w:hAnsi="Arial" w:cs="Arial"/>
-          <w:sz w:val="20"/>
-          <w:szCs w:val="20"/>
-          <w:highlight w:val="yellow"/>
-        </w:rPr>
-        <w:t xml:space="preserve"> Elaborado conforme a ABNT NBR 6027. </w:t>
-      </w:r>
-      <w:r>
-        <w:rPr>
-          <w:rFonts w:ascii="Arial" w:hAnsi="Arial" w:cs="Arial"/>
-          <w:sz w:val="20"/>
-          <w:szCs w:val="20"/>
-          <w:highlight w:val="yellow"/>
-        </w:rPr>
-        <w:t xml:space="preserve">O sumário c</w:t>
-      </w:r>
-      <w:r>
-        <w:rPr>
-          <w:rFonts w:ascii="Arial" w:hAnsi="Arial" w:cs="Arial"/>
-          <w:sz w:val="20"/>
-          <w:szCs w:val="20"/>
-          <w:highlight w:val="yellow"/>
-        </w:rPr>
-        <w:t xml:space="preserve">onsiste na enumeração dos capítulos e subcapítulos do trabalho, na ordem em que aparecem no texto, com a indicação da página inicial de cada </w:t>
-      </w:r>
-      <w:r>
-        <w:rPr>
-          <w:rFonts w:ascii="Arial" w:hAnsi="Arial" w:cs="Arial"/>
-          <w:sz w:val="20"/>
-          <w:szCs w:val="20"/>
-          <w:highlight w:val="yellow"/>
-        </w:rPr>
-        <w:t xml:space="preserve">seção</w:t>
-      </w:r>
-      <w:r>
-        <w:rPr>
-          <w:rFonts w:ascii="Arial" w:hAnsi="Arial" w:cs="Arial"/>
-          <w:sz w:val="20"/>
-          <w:szCs w:val="20"/>
-          <w:highlight w:val="yellow"/>
-        </w:rPr>
-        <w:t xml:space="preserve">. </w:t>
-      </w:r>
-      <w:r>
-        <w:rPr>
-          <w:rFonts w:ascii="Arial" w:hAnsi="Arial" w:cs="Arial"/>
-          <w:sz w:val="20"/>
-          <w:szCs w:val="20"/>
-          <w:highlight w:val="yellow"/>
-        </w:rPr>
-        <w:t xml:space="preserve">O</w:t>
-      </w:r>
-      <w:r>
-        <w:rPr>
-          <w:rFonts w:ascii="Arial" w:hAnsi="Arial" w:cs="Arial"/>
-          <w:sz w:val="20"/>
-          <w:szCs w:val="20"/>
-          <w:highlight w:val="yellow"/>
-        </w:rPr>
-        <w:t xml:space="preserve">s elementos pré-textuais não devem constar no sumário</w:t>
-      </w:r>
-      <w:r>
-        <w:rPr>
-          <w:rFonts w:ascii="Arial" w:hAnsi="Arial" w:cs="Arial"/>
-          <w:sz w:val="20"/>
-          <w:szCs w:val="20"/>
-          <w:highlight w:val="yellow"/>
-        </w:rPr>
-        <w:t xml:space="preserve">.</w:t>
-      </w:r>
-      <w:r>
-        <w:rPr>
-          <w:rFonts w:ascii="Arial" w:hAnsi="Arial" w:cs="Arial"/>
-          <w:sz w:val="20"/>
-          <w:szCs w:val="20"/>
-          <w:highlight w:val="yellow"/>
-        </w:rPr>
-        <w:t xml:space="preserve"> </w:t>
-      </w:r>
-      <w:r>
-        <w:rPr>
-          <w:rFonts w:ascii="Arial" w:hAnsi="Arial" w:cs="Arial"/>
-          <w:sz w:val="20"/>
-          <w:szCs w:val="20"/>
-          <w:highlight w:val="yellow"/>
-        </w:rPr>
-        <w:t xml:space="preserve">O sumário acima pode ser atualizado automaticamente, conforme os passos a seguir:</w:t>
-      </w:r>
-      <w:r>
-        <w:rPr>
-          <w:rFonts w:ascii="Arial" w:hAnsi="Arial" w:cs="Arial"/>
-          <w:sz w:val="20"/>
-          <w:szCs w:val="20"/>
-          <w:highlight w:val="yellow"/>
-        </w:rPr>
-        <w:t xml:space="preserve"> a) c</w:t>
-      </w:r>
-      <w:r>
-        <w:rPr>
-          <w:rFonts w:ascii="Arial" w:hAnsi="Arial" w:cs="Arial"/>
-          <w:sz w:val="20"/>
-          <w:szCs w:val="20"/>
-          <w:highlight w:val="yellow"/>
-        </w:rPr>
-        <w:t xml:space="preserve">lique com o botão direito do mouse sob </w:t>
-      </w:r>
-      <w:r>
-        <w:rPr>
-          <w:rFonts w:ascii="Arial" w:hAnsi="Arial" w:cs="Arial"/>
-          <w:sz w:val="20"/>
-          <w:szCs w:val="20"/>
-          <w:highlight w:val="yellow"/>
-        </w:rPr>
-        <w:t xml:space="preserve">qualquer título do sumário acima;</w:t>
-      </w:r>
-      <w:r>
-        <w:rPr>
-          <w:rFonts w:ascii="Arial" w:hAnsi="Arial" w:cs="Arial"/>
-          <w:sz w:val="20"/>
-          <w:szCs w:val="20"/>
-          <w:highlight w:val="yellow"/>
-        </w:rPr>
-        <w:t xml:space="preserve"> b) clique em a</w:t>
-      </w:r>
-      <w:r>
-        <w:rPr>
-          <w:rFonts w:ascii="Arial" w:hAnsi="Arial" w:cs="Arial"/>
-          <w:sz w:val="20"/>
-          <w:szCs w:val="20"/>
-          <w:highlight w:val="yellow"/>
-        </w:rPr>
-        <w:t xml:space="preserve">tualizar campo,</w:t>
-      </w:r>
-      <w:r>
-        <w:rPr>
-          <w:rFonts w:ascii="Arial" w:hAnsi="Arial" w:cs="Arial"/>
-          <w:sz w:val="20"/>
-          <w:szCs w:val="20"/>
-          <w:highlight w:val="yellow"/>
-        </w:rPr>
-        <w:t xml:space="preserve"> c) clique em a</w:t>
-      </w:r>
-      <w:r>
-        <w:rPr>
-          <w:rFonts w:ascii="Arial" w:hAnsi="Arial" w:cs="Arial"/>
-          <w:sz w:val="20"/>
-          <w:szCs w:val="20"/>
-          <w:highlight w:val="yellow"/>
-        </w:rPr>
-        <w:t xml:space="preserve">tualizar o índice inteiro</w:t>
-      </w:r>
-      <w:r>
-        <w:rPr>
-          <w:rFonts w:ascii="Arial" w:hAnsi="Arial" w:cs="Arial"/>
-          <w:sz w:val="20"/>
-          <w:szCs w:val="20"/>
-          <w:highlight w:val="yellow"/>
-        </w:rPr>
-        <w:t xml:space="preserve">. </w:t>
-      </w:r>
-      <w:r>
-        <w:rPr>
-          <w:rFonts w:ascii="Arial" w:hAnsi="Arial" w:cs="Arial"/>
-          <w:sz w:val="20"/>
-          <w:szCs w:val="20"/>
-          <w:highlight w:val="yellow"/>
-        </w:rPr>
-      </w:r>
-      <w:r>
-        <w:rPr>
-          <w:rFonts w:ascii="Arial" w:hAnsi="Arial" w:cs="Arial"/>
-          <w:sz w:val="20"/>
-          <w:szCs w:val="20"/>
-          <w:highlight w:val="yellow"/>
-        </w:rPr>
+        <w:t xml:space="preserve">COMENTÁRIO: Elaborado conforme a ABNT NBR 6027. O sumário consiste na enumeração dos capítulos e subcapítulos do trabalho, na ordem em que aparecem no texto, com a indicação da página inicial de cada seção. Os elementos pré-textuais não devem constar no sumário. O sumário acima pode ser atualizado automaticamente, conforme os passos a seguir: a) clique com o botão direito do mouse sob qualquer título do sumário acima; b) clique em atualizar campo, c) clique em atualizar o índice inteiro.</w:t>
       </w:r>
     </w:p>
     <w:p>
@@ -51026,6 +50682,12 @@
       <w:spacing w:after="100"/>
       <w:ind w:left="1320"/>
     </w:pPr>
+    <w:rPr>
+      <w:rFonts w:ascii="Arial" w:hAnsi="Arial" w:cs="Arial"/>
+      <w:color w:val="auto"/>
+      <w:sz w:val="24"/>
+      <w:szCs w:val="24"/>
+    </w:rPr>
   </w:style>
   <w:style w:type="paragraph" w:styleId="1041">
     <w:name w:val="toc 8"/>
@@ -51038,6 +50700,12 @@
       <w:spacing w:after="100"/>
       <w:ind w:left="1540"/>
     </w:pPr>
+    <w:rPr>
+      <w:rFonts w:ascii="Arial" w:hAnsi="Arial" w:cs="Arial"/>
+      <w:color w:val="auto"/>
+      <w:sz w:val="24"/>
+      <w:szCs w:val="24"/>
+    </w:rPr>
   </w:style>
   <w:style w:type="paragraph" w:styleId="1042">
     <w:name w:val="toc 9"/>
@@ -51050,6 +50718,12 @@
       <w:spacing w:after="100"/>
       <w:ind w:left="1760"/>
     </w:pPr>
+    <w:rPr>
+      <w:rFonts w:ascii="Arial" w:hAnsi="Arial" w:cs="Arial"/>
+      <w:color w:val="auto"/>
+      <w:sz w:val="24"/>
+      <w:szCs w:val="24"/>
+    </w:rPr>
   </w:style>
   <w:style w:type="character" w:styleId="1043">
     <w:name w:val="Placeholder Text"/>
@@ -51767,6 +51441,12 @@
       <w:spacing w:after="100"/>
       <w:ind w:firstLine="0"/>
     </w:pPr>
+    <w:rPr>
+      <w:rFonts w:ascii="Arial" w:hAnsi="Arial" w:cs="Arial"/>
+      <w:color w:val="auto"/>
+      <w:sz w:val="24"/>
+      <w:szCs w:val="24"/>
+    </w:rPr>
   </w:style>
   <w:style w:type="paragraph" w:styleId="1071">
     <w:name w:val="toc 1"/>
@@ -51786,7 +51466,11 @@
       <w:jc w:val="left"/>
     </w:pPr>
     <w:rPr>
+      <w:rFonts w:ascii="Arial" w:hAnsi="Arial" w:cs="Arial"/>
       <w:b/>
+      <w:color w:val="auto"/>
+      <w:sz w:val="24"/>
+      <w:szCs w:val="24"/>
     </w:rPr>
   </w:style>
   <w:style w:type="paragraph" w:styleId="1072">
@@ -51805,7 +51489,11 @@
       <w:ind w:firstLine="0"/>
     </w:pPr>
     <w:rPr>
+      <w:rFonts w:ascii="Arial" w:hAnsi="Arial" w:cs="Arial"/>
       <w:b/>
+      <w:color w:val="auto"/>
+      <w:sz w:val="24"/>
+      <w:szCs w:val="24"/>
     </w:rPr>
   </w:style>
   <w:style w:type="paragraph" w:styleId="1073">
@@ -51824,7 +51512,11 @@
       <w:ind w:firstLine="0"/>
     </w:pPr>
     <w:rPr>
+      <w:rFonts w:ascii="Arial" w:hAnsi="Arial" w:cs="Arial"/>
       <w:i/>
+      <w:color w:val="auto"/>
+      <w:sz w:val="24"/>
+      <w:szCs w:val="24"/>
     </w:rPr>
   </w:style>
   <w:style w:type="paragraph" w:styleId="1074">
@@ -51899,7 +51591,11 @@
       <w:ind w:firstLine="0" w:left="1134"/>
     </w:pPr>
     <w:rPr>
+      <w:rFonts w:ascii="Arial" w:hAnsi="Arial" w:cs="Arial"/>
       <w:b/>
+      <w:color w:val="auto"/>
+      <w:sz w:val="24"/>
+      <w:szCs w:val="24"/>
     </w:rPr>
   </w:style>
   <w:style w:type="paragraph" w:styleId="1078">
@@ -51937,7 +51633,10 @@
       <w:ind w:firstLine="0"/>
     </w:pPr>
     <w:rPr>
-      <w:rFonts w:cs="Arial"/>
+      <w:rFonts w:ascii="Arial" w:hAnsi="Arial" w:cs="Arial"/>
+      <w:color w:val="auto"/>
+      <w:sz w:val="24"/>
+      <w:szCs w:val="24"/>
     </w:rPr>
   </w:style>
   <w:style w:type="paragraph" w:styleId="1080">

</xml_diff>